<commit_message>
2608:18 ML Pham Thanh
</commit_message>
<xml_diff>
--- a/lesson04.docx
+++ b/lesson04.docx
@@ -1,6 +1,6 @@
 
 <file path=word/document.xml><?xml version="1.0" encoding="utf-8"?>
-<w:document xmlns:wpc="http://schemas.microsoft.com/office/word/2010/wordprocessingCanvas" xmlns:cx="http://schemas.microsoft.com/office/drawing/2014/chartex" xmlns:cx1="http://schemas.microsoft.com/office/drawing/2015/9/8/chartex" xmlns:cx2="http://schemas.microsoft.com/office/drawing/2015/10/21/chartex" xmlns:cx3="http://schemas.microsoft.com/office/drawing/2016/5/9/chartex" xmlns:cx4="http://schemas.microsoft.com/office/drawing/2016/5/10/chartex" xmlns:cx5="http://schemas.microsoft.com/office/drawing/2016/5/11/chartex" xmlns:cx6="http://schemas.microsoft.com/office/drawing/2016/5/12/chartex" xmlns:cx7="http://schemas.microsoft.com/office/drawing/2016/5/13/chartex" xmlns:cx8="http://schemas.microsoft.com/office/drawing/2016/5/14/chartex" xmlns:mc="http://schemas.openxmlformats.org/markup-compatibility/2006" xmlns:aink="http://schemas.microsoft.com/office/drawing/2016/ink" xmlns:am3d="http://schemas.microsoft.com/office/drawing/2017/model3d" xmlns:o="urn:schemas-microsoft-com:office:office" xmlns:oel="http://schemas.microsoft.com/office/2019/extlst" xmlns:r="http://schemas.openxmlformats.org/officeDocument/2006/relationships" xmlns:m="http://schemas.openxmlformats.org/officeDocument/2006/math" xmlns:v="urn:schemas-microsoft-com:vml" xmlns:wp14="http://schemas.microsoft.com/office/word/2010/wordprocessingDrawing" xmlns:wp="http://schemas.openxmlformats.org/drawingml/2006/wordprocessingDrawing" xmlns:w10="urn:schemas-microsoft-com:office:word" xmlns:w="http://schemas.openxmlformats.org/wordprocessingml/2006/main" xmlns:w14="http://schemas.microsoft.com/office/word/2010/wordml" xmlns:w15="http://schemas.microsoft.com/office/word/2012/wordml" xmlns:w16cex="http://schemas.microsoft.com/office/word/2018/wordml/cex" xmlns:w16cid="http://schemas.microsoft.com/office/word/2016/wordml/cid" xmlns:w16="http://schemas.microsoft.com/office/word/2018/wordml" xmlns:w16du="http://schemas.microsoft.com/office/word/2023/wordml/word16du" xmlns:w16sdtdh="http://schemas.microsoft.com/office/word/2020/wordml/sdtdatahash" xmlns:w16sdtfl="http://schemas.microsoft.com/office/word/2024/wordml/sdtformatlock" xmlns:w16se="http://schemas.microsoft.com/office/word/2015/wordml/symex" xmlns:wpg="http://schemas.microsoft.com/office/word/2010/wordprocessingGroup" xmlns:wpi="http://schemas.microsoft.com/office/word/2010/wordprocessingInk" xmlns:wne="http://schemas.microsoft.com/office/word/2006/wordml" xmlns:wps="http://schemas.microsoft.com/office/word/2010/wordprocessingShape" mc:Ignorable="w14 w15 w16se w16cid w16 w16cex w16sdtdh w16sdtfl w16du wp14">
+<w:document xmlns:wpc="http://schemas.microsoft.com/office/word/2010/wordprocessingCanvas" xmlns:cx="http://schemas.microsoft.com/office/drawing/2014/chartex" xmlns:mc="http://schemas.openxmlformats.org/markup-compatibility/2006" xmlns:o="urn:schemas-microsoft-com:office:office" xmlns:r="http://schemas.openxmlformats.org/officeDocument/2006/relationships" xmlns:m="http://schemas.openxmlformats.org/officeDocument/2006/math" xmlns:v="urn:schemas-microsoft-com:vml" xmlns:wp14="http://schemas.microsoft.com/office/word/2010/wordprocessingDrawing" xmlns:wp="http://schemas.openxmlformats.org/drawingml/2006/wordprocessingDrawing" xmlns:w10="urn:schemas-microsoft-com:office:word" xmlns:w="http://schemas.openxmlformats.org/wordprocessingml/2006/main" xmlns:w14="http://schemas.microsoft.com/office/word/2010/wordml" xmlns:w15="http://schemas.microsoft.com/office/word/2012/wordml" xmlns:w16se="http://schemas.microsoft.com/office/word/2015/wordml/symex" xmlns:wpg="http://schemas.microsoft.com/office/word/2010/wordprocessingGroup" xmlns:wpi="http://schemas.microsoft.com/office/word/2010/wordprocessingInk" xmlns:wne="http://schemas.microsoft.com/office/word/2006/wordml" xmlns:wps="http://schemas.microsoft.com/office/word/2010/wordprocessingShape" mc:Ignorable="w14 w15 w16se wp14">
   <w:body>
     <w:p>
       <w:pPr>
@@ -15,6 +15,9 @@
         <w:jc w:val="both"/>
       </w:pPr>
       <w:r>
+        <w:rPr>
+          <w:noProof/>
+        </w:rPr>
         <w:drawing>
           <wp:inline distT="0" distB="0" distL="0" distR="0" wp14:anchorId="5BFC7FC8" wp14:editId="065495A7">
             <wp:extent cx="5943600" cy="3549650"/>
@@ -238,6 +241,9 @@
         <w:jc w:val="both"/>
       </w:pPr>
       <w:r>
+        <w:rPr>
+          <w:noProof/>
+        </w:rPr>
         <w:drawing>
           <wp:inline distT="0" distB="0" distL="0" distR="0" wp14:anchorId="4CD84436" wp14:editId="0F056605">
             <wp:extent cx="5943600" cy="1490345"/>
@@ -683,6 +689,9 @@
         <w:jc w:val="both"/>
       </w:pPr>
       <w:r>
+        <w:rPr>
+          <w:noProof/>
+        </w:rPr>
         <w:drawing>
           <wp:inline distT="0" distB="0" distL="0" distR="0" wp14:anchorId="0C90CC51" wp14:editId="0444A679">
             <wp:extent cx="5943600" cy="1553210"/>
@@ -743,6 +752,9 @@
         <w:jc w:val="both"/>
       </w:pPr>
       <w:r>
+        <w:rPr>
+          <w:noProof/>
+        </w:rPr>
         <w:drawing>
           <wp:inline distT="0" distB="0" distL="0" distR="0" wp14:anchorId="7713DD6D" wp14:editId="4B7EEEA4">
             <wp:extent cx="5943600" cy="1428750"/>
@@ -1418,6 +1430,1381 @@
     </w:tbl>
     <w:p>
       <w:pPr>
+        <w:pBdr>
+          <w:bottom w:val="double" w:sz="6" w:space="1" w:color="auto"/>
+        </w:pBdr>
+        <w:jc w:val="both"/>
+        <w:rPr>
+          <w:b/>
+          <w:bCs/>
+        </w:rPr>
+      </w:pPr>
+    </w:p>
+    <w:p>
+      <w:pPr>
+        <w:jc w:val="both"/>
+        <w:rPr>
+          <w:b/>
+          <w:bCs/>
+        </w:rPr>
+      </w:pPr>
+      <w:r>
+        <w:rPr>
+          <w:b/>
+          <w:bCs/>
+        </w:rPr>
+        <w:lastRenderedPageBreak/>
+        <w:drawing>
+          <wp:inline distT="0" distB="0" distL="0" distR="0" wp14:anchorId="0E1C7CD9" wp14:editId="3A71F00A">
+            <wp:extent cx="5943600" cy="3346450"/>
+            <wp:effectExtent l="0" t="0" r="0" b="6350"/>
+            <wp:docPr id="1" name="Picture 1"/>
+            <wp:cNvGraphicFramePr>
+              <a:graphicFrameLocks xmlns:a="http://schemas.openxmlformats.org/drawingml/2006/main" noChangeAspect="1"/>
+            </wp:cNvGraphicFramePr>
+            <a:graphic xmlns:a="http://schemas.openxmlformats.org/drawingml/2006/main">
+              <a:graphicData uri="http://schemas.openxmlformats.org/drawingml/2006/picture">
+                <pic:pic xmlns:pic="http://schemas.openxmlformats.org/drawingml/2006/picture">
+                  <pic:nvPicPr>
+                    <pic:cNvPr id="1" name=""/>
+                    <pic:cNvPicPr/>
+                  </pic:nvPicPr>
+                  <pic:blipFill>
+                    <a:blip r:embed="rId9"/>
+                    <a:stretch>
+                      <a:fillRect/>
+                    </a:stretch>
+                  </pic:blipFill>
+                  <pic:spPr>
+                    <a:xfrm>
+                      <a:off x="0" y="0"/>
+                      <a:ext cx="5943600" cy="3346450"/>
+                    </a:xfrm>
+                    <a:prstGeom prst="rect">
+                      <a:avLst/>
+                    </a:prstGeom>
+                  </pic:spPr>
+                </pic:pic>
+              </a:graphicData>
+            </a:graphic>
+          </wp:inline>
+        </w:drawing>
+      </w:r>
+    </w:p>
+    <w:p>
+      <w:pPr>
+        <w:jc w:val="both"/>
+        <w:rPr>
+          <w:b/>
+          <w:bCs/>
+        </w:rPr>
+      </w:pPr>
+    </w:p>
+    <w:p>
+      <w:pPr>
+        <w:pStyle w:val="Heading2"/>
+      </w:pPr>
+      <w:r>
+        <w:t>Step 3.3: Các cách mã hóa nominal features</w:t>
+      </w:r>
+    </w:p>
+    <w:p>
+      <w:pPr>
+        <w:pStyle w:val="NormalWeb"/>
+      </w:pPr>
+      <w:r>
+        <w:t>Đây là 3 phương pháp chính để chuyển đổi biến định danh (nominal - không có thứ tự) thành dạng số để đưa vào mô hình. Mình giải thích chi tiết từng cách:</w:t>
+      </w:r>
+    </w:p>
+    <w:p>
+      <w:pPr>
+        <w:pStyle w:val="Heading3"/>
+      </w:pPr>
+      <w:r>
+        <w:t>1. One-hot encoding</w:t>
+      </w:r>
+    </w:p>
+    <w:p>
+      <w:pPr>
+        <w:pStyle w:val="NormalWeb"/>
+      </w:pPr>
+      <w:r>
+        <w:rPr>
+          <w:rStyle w:val="Strong"/>
+          <w:rFonts w:eastAsiaTheme="majorEastAsia"/>
+        </w:rPr>
+        <w:t>Cách làm:</w:t>
+      </w:r>
+      <w:r>
+        <w:t xml:space="preserve"> Mỗi giá trị được biểu diễn bằng một vector nhị phân, trong đó chỉ có đúng 1 vị trí = 1 (đúng vị trí tương ứng với giá trị đó), còn lại = 0.</w:t>
+      </w:r>
+    </w:p>
+    <w:p>
+      <w:pPr>
+        <w:pStyle w:val="NormalWeb"/>
+      </w:pPr>
+      <w:r>
+        <w:t xml:space="preserve">Ví dụ với </w:t>
+      </w:r>
+      <w:r>
+        <w:rPr>
+          <w:rStyle w:val="Strong"/>
+          <w:rFonts w:eastAsiaTheme="majorEastAsia"/>
+        </w:rPr>
+        <w:t>Color</w:t>
+      </w:r>
+      <w:r>
+        <w:t xml:space="preserve"> (4 giá trị: Red, Green, Blue, Black) → vector có độ dài 4:</w:t>
+      </w:r>
+    </w:p>
+    <w:p>
+      <w:pPr>
+        <w:numPr>
+          <w:ilvl w:val="0"/>
+          <w:numId w:val="8"/>
+        </w:numPr>
+        <w:spacing w:before="100" w:beforeAutospacing="1" w:after="100" w:afterAutospacing="1" w:line="240" w:lineRule="auto"/>
+      </w:pPr>
+      <w:r>
+        <w:t>Red → (1, 0, 0, 0)</w:t>
+      </w:r>
+    </w:p>
+    <w:p>
+      <w:pPr>
+        <w:numPr>
+          <w:ilvl w:val="0"/>
+          <w:numId w:val="8"/>
+        </w:numPr>
+        <w:spacing w:before="100" w:beforeAutospacing="1" w:after="100" w:afterAutospacing="1" w:line="240" w:lineRule="auto"/>
+      </w:pPr>
+      <w:r>
+        <w:t>Green → (0, 1, 0, 0)</w:t>
+      </w:r>
+    </w:p>
+    <w:p>
+      <w:pPr>
+        <w:numPr>
+          <w:ilvl w:val="0"/>
+          <w:numId w:val="8"/>
+        </w:numPr>
+        <w:spacing w:before="100" w:beforeAutospacing="1" w:after="100" w:afterAutospacing="1" w:line="240" w:lineRule="auto"/>
+      </w:pPr>
+      <w:r>
+        <w:t>Blue → (0, 0, 1, 0)</w:t>
+      </w:r>
+    </w:p>
+    <w:p>
+      <w:pPr>
+        <w:numPr>
+          <w:ilvl w:val="0"/>
+          <w:numId w:val="8"/>
+        </w:numPr>
+        <w:spacing w:before="100" w:beforeAutospacing="1" w:after="100" w:afterAutospacing="1" w:line="240" w:lineRule="auto"/>
+      </w:pPr>
+      <w:r>
+        <w:t>Black → (0, 0, 0, 1)</w:t>
+      </w:r>
+    </w:p>
+    <w:p>
+      <w:pPr>
+        <w:pStyle w:val="NormalWeb"/>
+      </w:pPr>
+      <w:r>
+        <w:rPr>
+          <w:rStyle w:val="Strong"/>
+          <w:rFonts w:eastAsiaTheme="majorEastAsia"/>
+        </w:rPr>
+        <w:t>Ưu điểm:</w:t>
+      </w:r>
+    </w:p>
+    <w:p>
+      <w:pPr>
+        <w:numPr>
+          <w:ilvl w:val="0"/>
+          <w:numId w:val="9"/>
+        </w:numPr>
+        <w:spacing w:before="100" w:beforeAutospacing="1" w:after="100" w:afterAutospacing="1" w:line="240" w:lineRule="auto"/>
+      </w:pPr>
+      <w:r>
+        <w:t>Đơn giản, dễ hiểu, dễ implement</w:t>
+      </w:r>
+    </w:p>
+    <w:p>
+      <w:pPr>
+        <w:numPr>
+          <w:ilvl w:val="0"/>
+          <w:numId w:val="9"/>
+        </w:numPr>
+        <w:spacing w:before="100" w:beforeAutospacing="1" w:after="100" w:afterAutospacing="1" w:line="240" w:lineRule="auto"/>
+      </w:pPr>
+      <w:r>
+        <w:t>Không tạo ra mối quan hệ thứ tự giả (không giống Label Encoding, nơi Red=0, Green=1 vô tình ngụ ý Green &gt; Red)</w:t>
+      </w:r>
+    </w:p>
+    <w:p>
+      <w:pPr>
+        <w:pStyle w:val="NormalWeb"/>
+      </w:pPr>
+      <w:r>
+        <w:rPr>
+          <w:rStyle w:val="Strong"/>
+          <w:rFonts w:eastAsiaTheme="majorEastAsia"/>
+        </w:rPr>
+        <w:lastRenderedPageBreak/>
+        <w:t>Nhược điểm:</w:t>
+      </w:r>
+    </w:p>
+    <w:p>
+      <w:pPr>
+        <w:numPr>
+          <w:ilvl w:val="0"/>
+          <w:numId w:val="10"/>
+        </w:numPr>
+        <w:spacing w:before="100" w:beforeAutospacing="1" w:after="100" w:afterAutospacing="1" w:line="240" w:lineRule="auto"/>
+      </w:pPr>
+      <w:r>
+        <w:rPr>
+          <w:rStyle w:val="Strong"/>
+        </w:rPr>
+        <w:t>Sparse data (dữ liệu thưa):</w:t>
+      </w:r>
+      <w:r>
+        <w:t xml:space="preserve"> Nếu có nn n giá trị khác nhau, mỗi vector có nn n chiều nhưng chỉ có 1 chiều khác 0 → lãng phí bộ nhớ khi nn n lớn (ví dụ: mã hóa quốc gia với 200 nước → vector 200 chiều toàn số 0)</w:t>
+      </w:r>
+    </w:p>
+    <w:p>
+      <w:pPr>
+        <w:pStyle w:val="Heading3"/>
+      </w:pPr>
+      <w:r>
+        <w:t>2. Hash encoding</w:t>
+      </w:r>
+    </w:p>
+    <w:p>
+      <w:pPr>
+        <w:pStyle w:val="NormalWeb"/>
+      </w:pPr>
+      <w:r>
+        <w:rPr>
+          <w:rStyle w:val="Strong"/>
+          <w:rFonts w:eastAsiaTheme="majorEastAsia"/>
+        </w:rPr>
+        <w:t>Cách làm:</w:t>
+      </w:r>
+      <w:r>
+        <w:t xml:space="preserve"> Dùng một hàm băm (hash function) h(x)h(x) h(x) để ánh xạ giá trị category vào một số nguyên trong khoảng cố định, rồi biểu diễn dưới dạng vector có độ dài </w:t>
+      </w:r>
+      <w:r>
+        <w:rPr>
+          <w:rStyle w:val="Strong"/>
+          <w:rFonts w:eastAsiaTheme="majorEastAsia"/>
+        </w:rPr>
+        <w:t>cố định trước</w:t>
+      </w:r>
+      <w:r>
+        <w:t xml:space="preserve"> (không phụ thuộc vào số lượng category thực tế).</w:t>
+      </w:r>
+    </w:p>
+    <w:p>
+      <w:pPr>
+        <w:pStyle w:val="NormalWeb"/>
+      </w:pPr>
+      <w:r>
+        <w:t xml:space="preserve">Ví dụ với </w:t>
+      </w:r>
+      <w:r>
+        <w:rPr>
+          <w:rStyle w:val="Strong"/>
+          <w:rFonts w:eastAsiaTheme="majorEastAsia"/>
+        </w:rPr>
+        <w:t>Country</w:t>
+      </w:r>
+      <w:r>
+        <w:t>, độ dài vector cố định = 3 (dù có thể có rất nhiều quốc gia):</w:t>
+      </w:r>
+    </w:p>
+    <w:p>
+      <w:pPr>
+        <w:numPr>
+          <w:ilvl w:val="0"/>
+          <w:numId w:val="11"/>
+        </w:numPr>
+        <w:spacing w:before="100" w:beforeAutospacing="1" w:after="100" w:afterAutospacing="1" w:line="240" w:lineRule="auto"/>
+      </w:pPr>
+      <w:r>
+        <w:t>USA → (1, 0, 0)</w:t>
+      </w:r>
+    </w:p>
+    <w:p>
+      <w:pPr>
+        <w:numPr>
+          <w:ilvl w:val="0"/>
+          <w:numId w:val="11"/>
+        </w:numPr>
+        <w:spacing w:before="100" w:beforeAutospacing="1" w:after="100" w:afterAutospacing="1" w:line="240" w:lineRule="auto"/>
+      </w:pPr>
+      <w:r>
+        <w:t>UK → (0, 0, 1)</w:t>
+      </w:r>
+    </w:p>
+    <w:p>
+      <w:pPr>
+        <w:numPr>
+          <w:ilvl w:val="0"/>
+          <w:numId w:val="11"/>
+        </w:numPr>
+        <w:spacing w:before="100" w:beforeAutospacing="1" w:after="100" w:afterAutospacing="1" w:line="240" w:lineRule="auto"/>
+      </w:pPr>
+      <w:r>
+        <w:t>Korea → (0, 1, 0)</w:t>
+      </w:r>
+    </w:p>
+    <w:p>
+      <w:pPr>
+        <w:numPr>
+          <w:ilvl w:val="0"/>
+          <w:numId w:val="11"/>
+        </w:numPr>
+        <w:spacing w:before="100" w:beforeAutospacing="1" w:after="100" w:afterAutospacing="1" w:line="240" w:lineRule="auto"/>
+      </w:pPr>
+      <w:r>
+        <w:t>Russia → (1, 0, 0) ← trùng với USA!</w:t>
+      </w:r>
+    </w:p>
+    <w:p>
+      <w:pPr>
+        <w:pStyle w:val="NormalWeb"/>
+      </w:pPr>
+      <w:r>
+        <w:rPr>
+          <w:rStyle w:val="Strong"/>
+          <w:rFonts w:eastAsiaTheme="majorEastAsia"/>
+        </w:rPr>
+        <w:t>Ưu điểm:</w:t>
+      </w:r>
+    </w:p>
+    <w:p>
+      <w:pPr>
+        <w:numPr>
+          <w:ilvl w:val="0"/>
+          <w:numId w:val="12"/>
+        </w:numPr>
+        <w:spacing w:before="100" w:beforeAutospacing="1" w:after="100" w:afterAutospacing="1" w:line="240" w:lineRule="auto"/>
+      </w:pPr>
+      <w:r>
+        <w:t>Đơn giản</w:t>
+      </w:r>
+    </w:p>
+    <w:p>
+      <w:pPr>
+        <w:numPr>
+          <w:ilvl w:val="0"/>
+          <w:numId w:val="12"/>
+        </w:numPr>
+        <w:spacing w:before="100" w:beforeAutospacing="1" w:after="100" w:afterAutospacing="1" w:line="240" w:lineRule="auto"/>
+      </w:pPr>
+      <w:r>
+        <w:t>Ít sparse hơn one-hot vì độ dài vector được kiểm soát cố định (không tăng theo số category)</w:t>
+      </w:r>
+    </w:p>
+    <w:p>
+      <w:pPr>
+        <w:pStyle w:val="NormalWeb"/>
+      </w:pPr>
+      <w:r>
+        <w:rPr>
+          <w:rStyle w:val="Strong"/>
+          <w:rFonts w:eastAsiaTheme="majorEastAsia"/>
+        </w:rPr>
+        <w:t>Nhược điểm:</w:t>
+      </w:r>
+    </w:p>
+    <w:p>
+      <w:pPr>
+        <w:numPr>
+          <w:ilvl w:val="0"/>
+          <w:numId w:val="13"/>
+        </w:numPr>
+        <w:spacing w:before="100" w:beforeAutospacing="1" w:after="100" w:afterAutospacing="1" w:line="240" w:lineRule="auto"/>
+      </w:pPr>
+      <w:r>
+        <w:rPr>
+          <w:rStyle w:val="Strong"/>
+        </w:rPr>
+        <w:t>Collision (đụng độ):</w:t>
+      </w:r>
+      <w:r>
+        <w:t xml:space="preserve"> Hai giá trị khác nhau (USA và Russia) có thể bị băm ra cùng một vector → mất thông tin, mô hình không phân biệt được</w:t>
+      </w:r>
+    </w:p>
+    <w:p>
+      <w:pPr>
+        <w:numPr>
+          <w:ilvl w:val="0"/>
+          <w:numId w:val="13"/>
+        </w:numPr>
+        <w:spacing w:before="100" w:beforeAutospacing="1" w:after="100" w:afterAutospacing="1" w:line="240" w:lineRule="auto"/>
+      </w:pPr>
+      <w:r>
+        <w:rPr>
+          <w:rStyle w:val="Strong"/>
+        </w:rPr>
+        <w:t>No inverse-mapping:</w:t>
+      </w:r>
+      <w:r>
+        <w:t xml:space="preserve"> Không thể giải mã ngược từ vector về giá trị gốc ban đầu (vì hash là hàm một chiều)</w:t>
+      </w:r>
+    </w:p>
+    <w:p>
+      <w:pPr>
+        <w:pStyle w:val="Heading3"/>
+      </w:pPr>
+      <w:r>
+        <w:t>3. Word Embedding</w:t>
+      </w:r>
+    </w:p>
+    <w:p>
+      <w:pPr>
+        <w:pStyle w:val="NormalWeb"/>
+      </w:pPr>
+      <w:r>
+        <w:rPr>
+          <w:rStyle w:val="Strong"/>
+          <w:rFonts w:eastAsiaTheme="majorEastAsia"/>
+        </w:rPr>
+        <w:t>Cách làm:</w:t>
+      </w:r>
+      <w:r>
+        <w:t xml:space="preserve"> Dùng một mô hình đã học (ví dụ Word2Vec) để biểu diễn mỗi giá trị bằng một vector số thực (dense vector), trong đó các giá trị </w:t>
+      </w:r>
+      <w:r>
+        <w:rPr>
+          <w:rStyle w:val="Strong"/>
+          <w:rFonts w:eastAsiaTheme="majorEastAsia"/>
+        </w:rPr>
+        <w:t>có ý nghĩa gần nhau về mặt ngữ nghĩa</w:t>
+      </w:r>
+      <w:r>
+        <w:t xml:space="preserve"> sẽ có vector gần nhau trong không gian.</w:t>
+      </w:r>
+    </w:p>
+    <w:p>
+      <w:pPr>
+        <w:pStyle w:val="NormalWeb"/>
+      </w:pPr>
+      <w:r>
+        <w:t xml:space="preserve">Ví dụ với </w:t>
+      </w:r>
+      <w:r>
+        <w:rPr>
+          <w:rStyle w:val="Strong"/>
+          <w:rFonts w:eastAsiaTheme="majorEastAsia"/>
+        </w:rPr>
+        <w:t>Animal</w:t>
+      </w:r>
+      <w:r>
+        <w:t>:</w:t>
+      </w:r>
+    </w:p>
+    <w:p>
+      <w:pPr>
+        <w:numPr>
+          <w:ilvl w:val="0"/>
+          <w:numId w:val="14"/>
+        </w:numPr>
+        <w:spacing w:before="100" w:beforeAutospacing="1" w:after="100" w:afterAutospacing="1" w:line="240" w:lineRule="auto"/>
+      </w:pPr>
+      <w:r>
+        <w:t>Dog → (0.27, -0.31, -0.53)</w:t>
+      </w:r>
+    </w:p>
+    <w:p>
+      <w:pPr>
+        <w:numPr>
+          <w:ilvl w:val="0"/>
+          <w:numId w:val="14"/>
+        </w:numPr>
+        <w:spacing w:before="100" w:beforeAutospacing="1" w:after="100" w:afterAutospacing="1" w:line="240" w:lineRule="auto"/>
+      </w:pPr>
+      <w:r>
+        <w:t>Lion → (-0.7, 0.61, 0.42)</w:t>
+      </w:r>
+    </w:p>
+    <w:p>
+      <w:pPr>
+        <w:numPr>
+          <w:ilvl w:val="0"/>
+          <w:numId w:val="14"/>
+        </w:numPr>
+        <w:spacing w:before="100" w:beforeAutospacing="1" w:after="100" w:afterAutospacing="1" w:line="240" w:lineRule="auto"/>
+      </w:pPr>
+      <w:r>
+        <w:t>Tiger → (-0.71, 0.6, 0.38)</w:t>
+      </w:r>
+    </w:p>
+    <w:p>
+      <w:pPr>
+        <w:numPr>
+          <w:ilvl w:val="0"/>
+          <w:numId w:val="14"/>
+        </w:numPr>
+        <w:spacing w:before="100" w:beforeAutospacing="1" w:after="100" w:afterAutospacing="1" w:line="240" w:lineRule="auto"/>
+      </w:pPr>
+      <w:r>
+        <w:t>Mouse → (0.31, -0.34, 0.76)</w:t>
+      </w:r>
+    </w:p>
+    <w:p>
+      <w:pPr>
+        <w:pStyle w:val="NormalWeb"/>
+      </w:pPr>
+      <w:r>
+        <w:lastRenderedPageBreak/>
+        <w:t>Chú ý: Lion và Tiger có vector khá gần nhau (đều là mèo lớn/thú săn mồi), trong khi Dog và Mouse gần nhau hơn ở chiều khác — mô hình đã "học" được mối quan hệ ngữ nghĩa giữa các loài.</w:t>
+      </w:r>
+    </w:p>
+    <w:p>
+      <w:pPr>
+        <w:pStyle w:val="NormalWeb"/>
+      </w:pPr>
+      <w:r>
+        <w:rPr>
+          <w:rStyle w:val="Strong"/>
+          <w:rFonts w:eastAsiaTheme="majorEastAsia"/>
+        </w:rPr>
+        <w:t>Ưu điểm:</w:t>
+      </w:r>
+    </w:p>
+    <w:p>
+      <w:pPr>
+        <w:numPr>
+          <w:ilvl w:val="0"/>
+          <w:numId w:val="15"/>
+        </w:numPr>
+        <w:spacing w:before="100" w:beforeAutospacing="1" w:after="100" w:afterAutospacing="1" w:line="240" w:lineRule="auto"/>
+      </w:pPr>
+      <w:r>
+        <w:rPr>
+          <w:rStyle w:val="Strong"/>
+        </w:rPr>
+        <w:t>Memory efficient:</w:t>
+      </w:r>
+      <w:r>
+        <w:t xml:space="preserve"> Vector dày đặc (dense), số chiều thấp hơn nhiều so với one-hot dù có hàng nghìn category</w:t>
+      </w:r>
+    </w:p>
+    <w:p>
+      <w:pPr>
+        <w:numPr>
+          <w:ilvl w:val="0"/>
+          <w:numId w:val="15"/>
+        </w:numPr>
+        <w:spacing w:before="100" w:beforeAutospacing="1" w:after="100" w:afterAutospacing="1" w:line="240" w:lineRule="auto"/>
+      </w:pPr>
+      <w:r>
+        <w:rPr>
+          <w:rStyle w:val="Strong"/>
+        </w:rPr>
+        <w:t>Relationship learnt:</w:t>
+      </w:r>
+      <w:r>
+        <w:t xml:space="preserve"> Nắm bắt được mối quan hệ/độ tương đồng giữa các giá trị (điều mà one-hot và hash encoding không làm được)</w:t>
+      </w:r>
+    </w:p>
+    <w:p>
+      <w:pPr>
+        <w:pStyle w:val="NormalWeb"/>
+      </w:pPr>
+      <w:r>
+        <w:rPr>
+          <w:rStyle w:val="Strong"/>
+          <w:rFonts w:eastAsiaTheme="majorEastAsia"/>
+        </w:rPr>
+        <w:t>Nhược điểm:</w:t>
+      </w:r>
+    </w:p>
+    <w:p>
+      <w:pPr>
+        <w:spacing w:after="0" w:line="240" w:lineRule="auto"/>
+        <w:rPr>
+          <w:rFonts w:ascii="Times New Roman" w:eastAsia="Times New Roman" w:hAnsi="Times New Roman" w:cs="Times New Roman"/>
+          <w:kern w:val="0"/>
+          <w14:ligatures w14:val="none"/>
+        </w:rPr>
+      </w:pPr>
+      <w:r>
+        <w:rPr>
+          <w:rFonts w:ascii="Times New Roman" w:eastAsia="Times New Roman" w:hAnsi="Symbol" w:cs="Times New Roman"/>
+          <w:kern w:val="0"/>
+          <w14:ligatures w14:val="none"/>
+        </w:rPr>
+        <w:t></w:t>
+      </w:r>
+      <w:r>
+        <w:rPr>
+          <w:rFonts w:ascii="Times New Roman" w:eastAsia="Times New Roman" w:hAnsi="Times New Roman" w:cs="Times New Roman"/>
+          <w:kern w:val="0"/>
+          <w14:ligatures w14:val="none"/>
+        </w:rPr>
+        <w:t xml:space="preserve">  </w:t>
+      </w:r>
+      <w:r>
+        <w:rPr>
+          <w:rFonts w:ascii="Times New Roman" w:eastAsia="Times New Roman" w:hAnsi="Times New Roman" w:cs="Times New Roman"/>
+          <w:b/>
+          <w:bCs/>
+          <w:kern w:val="0"/>
+          <w14:ligatures w14:val="none"/>
+        </w:rPr>
+        <w:t>Word2vec model needed:</w:t>
+      </w:r>
+      <w:r>
+        <w:rPr>
+          <w:rFonts w:ascii="Times New Roman" w:eastAsia="Times New Roman" w:hAnsi="Times New Roman" w:cs="Times New Roman"/>
+          <w:kern w:val="0"/>
+          <w14:ligatures w14:val="none"/>
+        </w:rPr>
+        <w:t xml:space="preserve"> Cần huấn luyện (hoặc dùng) một mô hình embedding riêng, phức tạp hơn nhiều so với 2 cách trên </w:t>
+      </w:r>
+    </w:p>
+    <w:p>
+      <w:pPr>
+        <w:jc w:val="both"/>
+        <w:rPr>
+          <w:rFonts w:ascii="Times New Roman" w:eastAsia="Times New Roman" w:hAnsi="Times New Roman" w:cs="Times New Roman"/>
+          <w:kern w:val="0"/>
+          <w14:ligatures w14:val="none"/>
+        </w:rPr>
+      </w:pPr>
+      <w:r>
+        <w:rPr>
+          <w:rFonts w:ascii="Times New Roman" w:eastAsia="Times New Roman" w:hAnsi="Symbol" w:cs="Times New Roman"/>
+          <w:kern w:val="0"/>
+          <w14:ligatures w14:val="none"/>
+        </w:rPr>
+        <w:t></w:t>
+      </w:r>
+      <w:r>
+        <w:rPr>
+          <w:rFonts w:ascii="Times New Roman" w:eastAsia="Times New Roman" w:hAnsi="Times New Roman" w:cs="Times New Roman"/>
+          <w:kern w:val="0"/>
+          <w14:ligatures w14:val="none"/>
+        </w:rPr>
+        <w:t xml:space="preserve">  </w:t>
+      </w:r>
+      <w:r>
+        <w:rPr>
+          <w:rFonts w:ascii="Times New Roman" w:eastAsia="Times New Roman" w:hAnsi="Times New Roman" w:cs="Times New Roman"/>
+          <w:b/>
+          <w:bCs/>
+          <w:kern w:val="0"/>
+          <w14:ligatures w14:val="none"/>
+        </w:rPr>
+        <w:t>Maybe many dimensions needed:</w:t>
+      </w:r>
+      <w:r>
+        <w:rPr>
+          <w:rFonts w:ascii="Times New Roman" w:eastAsia="Times New Roman" w:hAnsi="Times New Roman" w:cs="Times New Roman"/>
+          <w:kern w:val="0"/>
+          <w14:ligatures w14:val="none"/>
+        </w:rPr>
+        <w:t xml:space="preserve"> Đôi khi vẫn cần vector nhiều chiều để biểu diễn đủ chính xác mối quan hệ phức tạp</w:t>
+      </w:r>
+    </w:p>
+    <w:p>
+      <w:pPr>
+        <w:spacing w:before="100" w:beforeAutospacing="1" w:after="100" w:afterAutospacing="1" w:line="240" w:lineRule="auto"/>
+        <w:rPr>
+          <w:rFonts w:ascii="Times New Roman" w:eastAsia="Times New Roman" w:hAnsi="Times New Roman" w:cs="Times New Roman"/>
+          <w:kern w:val="0"/>
+          <w14:ligatures w14:val="none"/>
+        </w:rPr>
+      </w:pPr>
+      <w:r>
+        <w:rPr>
+          <w:rFonts w:ascii="Times New Roman" w:eastAsia="Times New Roman" w:hAnsi="Times New Roman" w:cs="Times New Roman"/>
+          <w:b/>
+          <w:bCs/>
+          <w:kern w:val="0"/>
+          <w14:ligatures w14:val="none"/>
+        </w:rPr>
+        <w:t>Bảng so sánh nhanh:</w:t>
+      </w:r>
+    </w:p>
+    <w:tbl>
+      <w:tblPr>
+        <w:tblW w:w="0" w:type="auto"/>
+        <w:tblCellSpacing w:w="15" w:type="dxa"/>
+        <w:tblCellMar>
+          <w:top w:w="15" w:type="dxa"/>
+          <w:left w:w="15" w:type="dxa"/>
+          <w:bottom w:w="15" w:type="dxa"/>
+          <w:right w:w="15" w:type="dxa"/>
+        </w:tblCellMar>
+        <w:tblLook w:val="04A0" w:firstRow="1" w:lastRow="0" w:firstColumn="1" w:lastColumn="0" w:noHBand="0" w:noVBand="1"/>
+      </w:tblPr>
+      <w:tblGrid>
+        <w:gridCol w:w="2388"/>
+        <w:gridCol w:w="1114"/>
+        <w:gridCol w:w="1567"/>
+        <w:gridCol w:w="2223"/>
+      </w:tblGrid>
+      <w:tr>
+        <w:trPr>
+          <w:tblHeader/>
+          <w:tblCellSpacing w:w="15" w:type="dxa"/>
+        </w:trPr>
+        <w:tc>
+          <w:tcPr>
+            <w:tcW w:w="0" w:type="auto"/>
+            <w:vAlign w:val="center"/>
+            <w:hideMark/>
+          </w:tcPr>
+          <w:p>
+            <w:pPr>
+              <w:spacing w:after="0" w:line="240" w:lineRule="auto"/>
+              <w:rPr>
+                <w:rFonts w:ascii="Times New Roman" w:eastAsia="Times New Roman" w:hAnsi="Times New Roman" w:cs="Times New Roman"/>
+                <w:b/>
+                <w:bCs/>
+                <w:kern w:val="0"/>
+                <w14:ligatures w14:val="none"/>
+              </w:rPr>
+            </w:pPr>
+            <w:r>
+              <w:rPr>
+                <w:rFonts w:ascii="Times New Roman" w:eastAsia="Times New Roman" w:hAnsi="Times New Roman" w:cs="Times New Roman"/>
+                <w:b/>
+                <w:bCs/>
+                <w:kern w:val="0"/>
+                <w14:ligatures w14:val="none"/>
+              </w:rPr>
+              <w:t>Tiêu chí</w:t>
+            </w:r>
+          </w:p>
+        </w:tc>
+        <w:tc>
+          <w:tcPr>
+            <w:tcW w:w="0" w:type="auto"/>
+            <w:vAlign w:val="center"/>
+            <w:hideMark/>
+          </w:tcPr>
+          <w:p>
+            <w:pPr>
+              <w:spacing w:after="0" w:line="240" w:lineRule="auto"/>
+              <w:jc w:val="center"/>
+              <w:rPr>
+                <w:rFonts w:ascii="Times New Roman" w:eastAsia="Times New Roman" w:hAnsi="Times New Roman" w:cs="Times New Roman"/>
+                <w:b/>
+                <w:bCs/>
+                <w:kern w:val="0"/>
+                <w14:ligatures w14:val="none"/>
+              </w:rPr>
+            </w:pPr>
+            <w:r>
+              <w:rPr>
+                <w:rFonts w:ascii="Times New Roman" w:eastAsia="Times New Roman" w:hAnsi="Times New Roman" w:cs="Times New Roman"/>
+                <w:b/>
+                <w:bCs/>
+                <w:kern w:val="0"/>
+                <w14:ligatures w14:val="none"/>
+              </w:rPr>
+              <w:t>One-hot</w:t>
+            </w:r>
+          </w:p>
+        </w:tc>
+        <w:tc>
+          <w:tcPr>
+            <w:tcW w:w="0" w:type="auto"/>
+            <w:vAlign w:val="center"/>
+            <w:hideMark/>
+          </w:tcPr>
+          <w:p>
+            <w:pPr>
+              <w:spacing w:after="0" w:line="240" w:lineRule="auto"/>
+              <w:jc w:val="center"/>
+              <w:rPr>
+                <w:rFonts w:ascii="Times New Roman" w:eastAsia="Times New Roman" w:hAnsi="Times New Roman" w:cs="Times New Roman"/>
+                <w:b/>
+                <w:bCs/>
+                <w:kern w:val="0"/>
+                <w14:ligatures w14:val="none"/>
+              </w:rPr>
+            </w:pPr>
+            <w:r>
+              <w:rPr>
+                <w:rFonts w:ascii="Times New Roman" w:eastAsia="Times New Roman" w:hAnsi="Times New Roman" w:cs="Times New Roman"/>
+                <w:b/>
+                <w:bCs/>
+                <w:kern w:val="0"/>
+                <w14:ligatures w14:val="none"/>
+              </w:rPr>
+              <w:t>Hash</w:t>
+            </w:r>
+          </w:p>
+        </w:tc>
+        <w:tc>
+          <w:tcPr>
+            <w:tcW w:w="0" w:type="auto"/>
+            <w:vAlign w:val="center"/>
+            <w:hideMark/>
+          </w:tcPr>
+          <w:p>
+            <w:pPr>
+              <w:spacing w:after="0" w:line="240" w:lineRule="auto"/>
+              <w:jc w:val="center"/>
+              <w:rPr>
+                <w:rFonts w:ascii="Times New Roman" w:eastAsia="Times New Roman" w:hAnsi="Times New Roman" w:cs="Times New Roman"/>
+                <w:b/>
+                <w:bCs/>
+                <w:kern w:val="0"/>
+                <w14:ligatures w14:val="none"/>
+              </w:rPr>
+            </w:pPr>
+            <w:r>
+              <w:rPr>
+                <w:rFonts w:ascii="Times New Roman" w:eastAsia="Times New Roman" w:hAnsi="Times New Roman" w:cs="Times New Roman"/>
+                <w:b/>
+                <w:bCs/>
+                <w:kern w:val="0"/>
+                <w14:ligatures w14:val="none"/>
+              </w:rPr>
+              <w:t xml:space="preserve">     </w:t>
+            </w:r>
+            <w:r>
+              <w:rPr>
+                <w:rFonts w:ascii="Times New Roman" w:eastAsia="Times New Roman" w:hAnsi="Times New Roman" w:cs="Times New Roman"/>
+                <w:b/>
+                <w:bCs/>
+                <w:kern w:val="0"/>
+                <w14:ligatures w14:val="none"/>
+              </w:rPr>
+              <w:t>Word Embedding</w:t>
+            </w:r>
+          </w:p>
+        </w:tc>
+      </w:tr>
+      <w:tr>
+        <w:trPr>
+          <w:tblCellSpacing w:w="15" w:type="dxa"/>
+        </w:trPr>
+        <w:tc>
+          <w:tcPr>
+            <w:tcW w:w="0" w:type="auto"/>
+            <w:vAlign w:val="center"/>
+            <w:hideMark/>
+          </w:tcPr>
+          <w:p>
+            <w:pPr>
+              <w:spacing w:after="0" w:line="240" w:lineRule="auto"/>
+              <w:rPr>
+                <w:rFonts w:ascii="Times New Roman" w:eastAsia="Times New Roman" w:hAnsi="Times New Roman" w:cs="Times New Roman"/>
+                <w:kern w:val="0"/>
+                <w14:ligatures w14:val="none"/>
+              </w:rPr>
+            </w:pPr>
+            <w:r>
+              <w:rPr>
+                <w:rFonts w:ascii="Times New Roman" w:eastAsia="Times New Roman" w:hAnsi="Times New Roman" w:cs="Times New Roman"/>
+                <w:kern w:val="0"/>
+                <w14:ligatures w14:val="none"/>
+              </w:rPr>
+              <w:t>Độ phức tạp</w:t>
+            </w:r>
+          </w:p>
+        </w:tc>
+        <w:tc>
+          <w:tcPr>
+            <w:tcW w:w="0" w:type="auto"/>
+            <w:vAlign w:val="center"/>
+            <w:hideMark/>
+          </w:tcPr>
+          <w:p>
+            <w:pPr>
+              <w:spacing w:after="0" w:line="240" w:lineRule="auto"/>
+              <w:rPr>
+                <w:rFonts w:ascii="Times New Roman" w:eastAsia="Times New Roman" w:hAnsi="Times New Roman" w:cs="Times New Roman"/>
+                <w:kern w:val="0"/>
+                <w14:ligatures w14:val="none"/>
+              </w:rPr>
+            </w:pPr>
+            <w:r>
+              <w:rPr>
+                <w:rFonts w:ascii="Times New Roman" w:eastAsia="Times New Roman" w:hAnsi="Times New Roman" w:cs="Times New Roman"/>
+                <w:kern w:val="0"/>
+                <w14:ligatures w14:val="none"/>
+              </w:rPr>
+              <w:t xml:space="preserve"> </w:t>
+            </w:r>
+            <w:r>
+              <w:rPr>
+                <w:rFonts w:ascii="Times New Roman" w:eastAsia="Times New Roman" w:hAnsi="Times New Roman" w:cs="Times New Roman"/>
+                <w:kern w:val="0"/>
+                <w14:ligatures w14:val="none"/>
+              </w:rPr>
+              <w:t>Thấp</w:t>
+            </w:r>
+          </w:p>
+        </w:tc>
+        <w:tc>
+          <w:tcPr>
+            <w:tcW w:w="0" w:type="auto"/>
+            <w:vAlign w:val="center"/>
+            <w:hideMark/>
+          </w:tcPr>
+          <w:p>
+            <w:pPr>
+              <w:spacing w:after="0" w:line="240" w:lineRule="auto"/>
+              <w:rPr>
+                <w:rFonts w:ascii="Times New Roman" w:eastAsia="Times New Roman" w:hAnsi="Times New Roman" w:cs="Times New Roman"/>
+                <w:kern w:val="0"/>
+                <w14:ligatures w14:val="none"/>
+              </w:rPr>
+            </w:pPr>
+            <w:r>
+              <w:rPr>
+                <w:rFonts w:ascii="Times New Roman" w:eastAsia="Times New Roman" w:hAnsi="Times New Roman" w:cs="Times New Roman"/>
+                <w:kern w:val="0"/>
+                <w14:ligatures w14:val="none"/>
+              </w:rPr>
+              <w:t xml:space="preserve">   </w:t>
+            </w:r>
+            <w:r>
+              <w:rPr>
+                <w:rFonts w:ascii="Times New Roman" w:eastAsia="Times New Roman" w:hAnsi="Times New Roman" w:cs="Times New Roman"/>
+                <w:kern w:val="0"/>
+                <w14:ligatures w14:val="none"/>
+              </w:rPr>
+              <w:t>Thấp</w:t>
+            </w:r>
+          </w:p>
+        </w:tc>
+        <w:tc>
+          <w:tcPr>
+            <w:tcW w:w="0" w:type="auto"/>
+            <w:vAlign w:val="center"/>
+            <w:hideMark/>
+          </w:tcPr>
+          <w:p>
+            <w:pPr>
+              <w:spacing w:after="0" w:line="240" w:lineRule="auto"/>
+              <w:rPr>
+                <w:rFonts w:ascii="Times New Roman" w:eastAsia="Times New Roman" w:hAnsi="Times New Roman" w:cs="Times New Roman"/>
+                <w:kern w:val="0"/>
+                <w14:ligatures w14:val="none"/>
+              </w:rPr>
+            </w:pPr>
+            <w:r>
+              <w:rPr>
+                <w:rFonts w:ascii="Times New Roman" w:eastAsia="Times New Roman" w:hAnsi="Times New Roman" w:cs="Times New Roman"/>
+                <w:kern w:val="0"/>
+                <w14:ligatures w14:val="none"/>
+              </w:rPr>
+              <w:t xml:space="preserve">     </w:t>
+            </w:r>
+            <w:r>
+              <w:rPr>
+                <w:rFonts w:ascii="Times New Roman" w:eastAsia="Times New Roman" w:hAnsi="Times New Roman" w:cs="Times New Roman"/>
+                <w:kern w:val="0"/>
+                <w14:ligatures w14:val="none"/>
+              </w:rPr>
+              <w:t>Cao</w:t>
+            </w:r>
+          </w:p>
+        </w:tc>
+      </w:tr>
+      <w:tr>
+        <w:trPr>
+          <w:tblCellSpacing w:w="15" w:type="dxa"/>
+        </w:trPr>
+        <w:tc>
+          <w:tcPr>
+            <w:tcW w:w="0" w:type="auto"/>
+            <w:vAlign w:val="center"/>
+            <w:hideMark/>
+          </w:tcPr>
+          <w:p>
+            <w:pPr>
+              <w:spacing w:after="0" w:line="240" w:lineRule="auto"/>
+              <w:rPr>
+                <w:rFonts w:ascii="Times New Roman" w:eastAsia="Times New Roman" w:hAnsi="Times New Roman" w:cs="Times New Roman"/>
+                <w:kern w:val="0"/>
+                <w14:ligatures w14:val="none"/>
+              </w:rPr>
+            </w:pPr>
+            <w:r>
+              <w:rPr>
+                <w:rFonts w:ascii="Times New Roman" w:eastAsia="Times New Roman" w:hAnsi="Times New Roman" w:cs="Times New Roman"/>
+                <w:kern w:val="0"/>
+                <w14:ligatures w14:val="none"/>
+              </w:rPr>
+              <w:t>Sparse?</w:t>
+            </w:r>
+          </w:p>
+        </w:tc>
+        <w:tc>
+          <w:tcPr>
+            <w:tcW w:w="0" w:type="auto"/>
+            <w:vAlign w:val="center"/>
+            <w:hideMark/>
+          </w:tcPr>
+          <w:p>
+            <w:pPr>
+              <w:spacing w:after="0" w:line="240" w:lineRule="auto"/>
+              <w:rPr>
+                <w:rFonts w:ascii="Times New Roman" w:eastAsia="Times New Roman" w:hAnsi="Times New Roman" w:cs="Times New Roman"/>
+                <w:kern w:val="0"/>
+                <w14:ligatures w14:val="none"/>
+              </w:rPr>
+            </w:pPr>
+            <w:r>
+              <w:rPr>
+                <w:rFonts w:ascii="Times New Roman" w:eastAsia="Times New Roman" w:hAnsi="Times New Roman" w:cs="Times New Roman"/>
+                <w:kern w:val="0"/>
+                <w14:ligatures w14:val="none"/>
+              </w:rPr>
+              <w:t xml:space="preserve"> </w:t>
+            </w:r>
+            <w:r>
+              <w:rPr>
+                <w:rFonts w:ascii="Times New Roman" w:eastAsia="Times New Roman" w:hAnsi="Times New Roman" w:cs="Times New Roman"/>
+                <w:kern w:val="0"/>
+                <w14:ligatures w14:val="none"/>
+              </w:rPr>
+              <w:t>Rất sparse</w:t>
+            </w:r>
+          </w:p>
+        </w:tc>
+        <w:tc>
+          <w:tcPr>
+            <w:tcW w:w="0" w:type="auto"/>
+            <w:vAlign w:val="center"/>
+            <w:hideMark/>
+          </w:tcPr>
+          <w:p>
+            <w:pPr>
+              <w:spacing w:after="0" w:line="240" w:lineRule="auto"/>
+              <w:rPr>
+                <w:rFonts w:ascii="Times New Roman" w:eastAsia="Times New Roman" w:hAnsi="Times New Roman" w:cs="Times New Roman"/>
+                <w:kern w:val="0"/>
+                <w14:ligatures w14:val="none"/>
+              </w:rPr>
+            </w:pPr>
+            <w:r>
+              <w:rPr>
+                <w:rFonts w:ascii="Times New Roman" w:eastAsia="Times New Roman" w:hAnsi="Times New Roman" w:cs="Times New Roman"/>
+                <w:kern w:val="0"/>
+                <w14:ligatures w14:val="none"/>
+              </w:rPr>
+              <w:t xml:space="preserve">   </w:t>
+            </w:r>
+            <w:r>
+              <w:rPr>
+                <w:rFonts w:ascii="Times New Roman" w:eastAsia="Times New Roman" w:hAnsi="Times New Roman" w:cs="Times New Roman"/>
+                <w:kern w:val="0"/>
+                <w14:ligatures w14:val="none"/>
+              </w:rPr>
+              <w:t>Ít sparse hơn</w:t>
+            </w:r>
+          </w:p>
+        </w:tc>
+        <w:tc>
+          <w:tcPr>
+            <w:tcW w:w="0" w:type="auto"/>
+            <w:vAlign w:val="center"/>
+            <w:hideMark/>
+          </w:tcPr>
+          <w:p>
+            <w:pPr>
+              <w:spacing w:after="0" w:line="240" w:lineRule="auto"/>
+              <w:rPr>
+                <w:rFonts w:ascii="Times New Roman" w:eastAsia="Times New Roman" w:hAnsi="Times New Roman" w:cs="Times New Roman"/>
+                <w:kern w:val="0"/>
+                <w14:ligatures w14:val="none"/>
+              </w:rPr>
+            </w:pPr>
+            <w:r>
+              <w:rPr>
+                <w:rFonts w:ascii="Times New Roman" w:eastAsia="Times New Roman" w:hAnsi="Times New Roman" w:cs="Times New Roman"/>
+                <w:kern w:val="0"/>
+                <w14:ligatures w14:val="none"/>
+              </w:rPr>
+              <w:t xml:space="preserve">     </w:t>
+            </w:r>
+            <w:r>
+              <w:rPr>
+                <w:rFonts w:ascii="Times New Roman" w:eastAsia="Times New Roman" w:hAnsi="Times New Roman" w:cs="Times New Roman"/>
+                <w:kern w:val="0"/>
+                <w14:ligatures w14:val="none"/>
+              </w:rPr>
+              <w:t>Dense</w:t>
+            </w:r>
+          </w:p>
+        </w:tc>
+      </w:tr>
+      <w:tr>
+        <w:trPr>
+          <w:tblCellSpacing w:w="15" w:type="dxa"/>
+        </w:trPr>
+        <w:tc>
+          <w:tcPr>
+            <w:tcW w:w="0" w:type="auto"/>
+            <w:vAlign w:val="center"/>
+            <w:hideMark/>
+          </w:tcPr>
+          <w:p>
+            <w:pPr>
+              <w:spacing w:after="0" w:line="240" w:lineRule="auto"/>
+              <w:rPr>
+                <w:rFonts w:ascii="Times New Roman" w:eastAsia="Times New Roman" w:hAnsi="Times New Roman" w:cs="Times New Roman"/>
+                <w:kern w:val="0"/>
+                <w14:ligatures w14:val="none"/>
+              </w:rPr>
+            </w:pPr>
+            <w:r>
+              <w:rPr>
+                <w:rFonts w:ascii="Times New Roman" w:eastAsia="Times New Roman" w:hAnsi="Times New Roman" w:cs="Times New Roman"/>
+                <w:kern w:val="0"/>
+                <w14:ligatures w14:val="none"/>
+              </w:rPr>
+              <w:t>Giữ quan hệ ngữ nghĩa?</w:t>
+            </w:r>
+          </w:p>
+        </w:tc>
+        <w:tc>
+          <w:tcPr>
+            <w:tcW w:w="0" w:type="auto"/>
+            <w:vAlign w:val="center"/>
+            <w:hideMark/>
+          </w:tcPr>
+          <w:p>
+            <w:pPr>
+              <w:spacing w:after="0" w:line="240" w:lineRule="auto"/>
+              <w:rPr>
+                <w:rFonts w:ascii="Times New Roman" w:eastAsia="Times New Roman" w:hAnsi="Times New Roman" w:cs="Times New Roman"/>
+                <w:kern w:val="0"/>
+                <w14:ligatures w14:val="none"/>
+              </w:rPr>
+            </w:pPr>
+            <w:r>
+              <w:rPr>
+                <w:rFonts w:ascii="Times New Roman" w:eastAsia="Times New Roman" w:hAnsi="Times New Roman" w:cs="Times New Roman"/>
+                <w:kern w:val="0"/>
+                <w14:ligatures w14:val="none"/>
+              </w:rPr>
+              <w:t xml:space="preserve"> </w:t>
+            </w:r>
+            <w:r>
+              <w:rPr>
+                <w:rFonts w:ascii="Times New Roman" w:eastAsia="Times New Roman" w:hAnsi="Times New Roman" w:cs="Times New Roman"/>
+                <w:kern w:val="0"/>
+                <w14:ligatures w14:val="none"/>
+              </w:rPr>
+              <w:t>Không</w:t>
+            </w:r>
+          </w:p>
+        </w:tc>
+        <w:tc>
+          <w:tcPr>
+            <w:tcW w:w="0" w:type="auto"/>
+            <w:vAlign w:val="center"/>
+            <w:hideMark/>
+          </w:tcPr>
+          <w:p>
+            <w:pPr>
+              <w:spacing w:after="0" w:line="240" w:lineRule="auto"/>
+              <w:rPr>
+                <w:rFonts w:ascii="Times New Roman" w:eastAsia="Times New Roman" w:hAnsi="Times New Roman" w:cs="Times New Roman"/>
+                <w:kern w:val="0"/>
+                <w14:ligatures w14:val="none"/>
+              </w:rPr>
+            </w:pPr>
+            <w:r>
+              <w:rPr>
+                <w:rFonts w:ascii="Times New Roman" w:eastAsia="Times New Roman" w:hAnsi="Times New Roman" w:cs="Times New Roman"/>
+                <w:kern w:val="0"/>
+                <w14:ligatures w14:val="none"/>
+              </w:rPr>
+              <w:t xml:space="preserve">   </w:t>
+            </w:r>
+            <w:r>
+              <w:rPr>
+                <w:rFonts w:ascii="Times New Roman" w:eastAsia="Times New Roman" w:hAnsi="Times New Roman" w:cs="Times New Roman"/>
+                <w:kern w:val="0"/>
+                <w14:ligatures w14:val="none"/>
+              </w:rPr>
+              <w:t>Không</w:t>
+            </w:r>
+          </w:p>
+        </w:tc>
+        <w:tc>
+          <w:tcPr>
+            <w:tcW w:w="0" w:type="auto"/>
+            <w:vAlign w:val="center"/>
+            <w:hideMark/>
+          </w:tcPr>
+          <w:p>
+            <w:pPr>
+              <w:spacing w:after="0" w:line="240" w:lineRule="auto"/>
+              <w:rPr>
+                <w:rFonts w:ascii="Times New Roman" w:eastAsia="Times New Roman" w:hAnsi="Times New Roman" w:cs="Times New Roman"/>
+                <w:kern w:val="0"/>
+                <w14:ligatures w14:val="none"/>
+              </w:rPr>
+            </w:pPr>
+            <w:r>
+              <w:rPr>
+                <w:rFonts w:ascii="Times New Roman" w:eastAsia="Times New Roman" w:hAnsi="Times New Roman" w:cs="Times New Roman"/>
+                <w:kern w:val="0"/>
+                <w14:ligatures w14:val="none"/>
+              </w:rPr>
+              <w:t xml:space="preserve">     </w:t>
+            </w:r>
+            <w:r>
+              <w:rPr>
+                <w:rFonts w:ascii="Times New Roman" w:eastAsia="Times New Roman" w:hAnsi="Times New Roman" w:cs="Times New Roman"/>
+                <w:kern w:val="0"/>
+                <w14:ligatures w14:val="none"/>
+              </w:rPr>
+              <w:t>Có</w:t>
+            </w:r>
+          </w:p>
+        </w:tc>
+      </w:tr>
+      <w:tr>
+        <w:trPr>
+          <w:tblCellSpacing w:w="15" w:type="dxa"/>
+        </w:trPr>
+        <w:tc>
+          <w:tcPr>
+            <w:tcW w:w="0" w:type="auto"/>
+            <w:vAlign w:val="center"/>
+            <w:hideMark/>
+          </w:tcPr>
+          <w:p>
+            <w:pPr>
+              <w:spacing w:after="0" w:line="240" w:lineRule="auto"/>
+              <w:rPr>
+                <w:rFonts w:ascii="Times New Roman" w:eastAsia="Times New Roman" w:hAnsi="Times New Roman" w:cs="Times New Roman"/>
+                <w:kern w:val="0"/>
+                <w14:ligatures w14:val="none"/>
+              </w:rPr>
+            </w:pPr>
+            <w:r>
+              <w:rPr>
+                <w:rFonts w:ascii="Times New Roman" w:eastAsia="Times New Roman" w:hAnsi="Times New Roman" w:cs="Times New Roman"/>
+                <w:kern w:val="0"/>
+                <w14:ligatures w14:val="none"/>
+              </w:rPr>
+              <w:t>Nguy cơ mất thông tin</w:t>
+            </w:r>
+          </w:p>
+        </w:tc>
+        <w:tc>
+          <w:tcPr>
+            <w:tcW w:w="0" w:type="auto"/>
+            <w:vAlign w:val="center"/>
+            <w:hideMark/>
+          </w:tcPr>
+          <w:p>
+            <w:pPr>
+              <w:spacing w:after="0" w:line="240" w:lineRule="auto"/>
+              <w:rPr>
+                <w:rFonts w:ascii="Times New Roman" w:eastAsia="Times New Roman" w:hAnsi="Times New Roman" w:cs="Times New Roman"/>
+                <w:kern w:val="0"/>
+                <w14:ligatures w14:val="none"/>
+              </w:rPr>
+            </w:pPr>
+            <w:r>
+              <w:rPr>
+                <w:rFonts w:ascii="Times New Roman" w:eastAsia="Times New Roman" w:hAnsi="Times New Roman" w:cs="Times New Roman"/>
+                <w:kern w:val="0"/>
+                <w14:ligatures w14:val="none"/>
+              </w:rPr>
+              <w:t xml:space="preserve"> </w:t>
+            </w:r>
+            <w:r>
+              <w:rPr>
+                <w:rFonts w:ascii="Times New Roman" w:eastAsia="Times New Roman" w:hAnsi="Times New Roman" w:cs="Times New Roman"/>
+                <w:kern w:val="0"/>
+                <w14:ligatures w14:val="none"/>
+              </w:rPr>
+              <w:t>Không</w:t>
+            </w:r>
+          </w:p>
+        </w:tc>
+        <w:tc>
+          <w:tcPr>
+            <w:tcW w:w="0" w:type="auto"/>
+            <w:vAlign w:val="center"/>
+            <w:hideMark/>
+          </w:tcPr>
+          <w:p>
+            <w:pPr>
+              <w:spacing w:after="0" w:line="240" w:lineRule="auto"/>
+              <w:rPr>
+                <w:rFonts w:ascii="Times New Roman" w:eastAsia="Times New Roman" w:hAnsi="Times New Roman" w:cs="Times New Roman"/>
+                <w:kern w:val="0"/>
+                <w14:ligatures w14:val="none"/>
+              </w:rPr>
+            </w:pPr>
+            <w:r>
+              <w:rPr>
+                <w:rFonts w:ascii="Times New Roman" w:eastAsia="Times New Roman" w:hAnsi="Times New Roman" w:cs="Times New Roman"/>
+                <w:kern w:val="0"/>
+                <w14:ligatures w14:val="none"/>
+              </w:rPr>
+              <w:t xml:space="preserve">   </w:t>
+            </w:r>
+            <w:r>
+              <w:rPr>
+                <w:rFonts w:ascii="Times New Roman" w:eastAsia="Times New Roman" w:hAnsi="Times New Roman" w:cs="Times New Roman"/>
+                <w:kern w:val="0"/>
+                <w14:ligatures w14:val="none"/>
+              </w:rPr>
+              <w:t>Có (collision)</w:t>
+            </w:r>
+          </w:p>
+        </w:tc>
+        <w:tc>
+          <w:tcPr>
+            <w:tcW w:w="0" w:type="auto"/>
+            <w:vAlign w:val="center"/>
+            <w:hideMark/>
+          </w:tcPr>
+          <w:p>
+            <w:pPr>
+              <w:spacing w:after="0" w:line="240" w:lineRule="auto"/>
+              <w:rPr>
+                <w:rFonts w:ascii="Times New Roman" w:eastAsia="Times New Roman" w:hAnsi="Times New Roman" w:cs="Times New Roman"/>
+                <w:kern w:val="0"/>
+                <w14:ligatures w14:val="none"/>
+              </w:rPr>
+            </w:pPr>
+            <w:r>
+              <w:rPr>
+                <w:rFonts w:ascii="Times New Roman" w:eastAsia="Times New Roman" w:hAnsi="Times New Roman" w:cs="Times New Roman"/>
+                <w:kern w:val="0"/>
+                <w14:ligatures w14:val="none"/>
+              </w:rPr>
+              <w:t xml:space="preserve">     </w:t>
+            </w:r>
+            <w:bookmarkStart w:id="0" w:name="_GoBack"/>
+            <w:bookmarkEnd w:id="0"/>
+            <w:r>
+              <w:rPr>
+                <w:rFonts w:ascii="Times New Roman" w:eastAsia="Times New Roman" w:hAnsi="Times New Roman" w:cs="Times New Roman"/>
+                <w:kern w:val="0"/>
+                <w14:ligatures w14:val="none"/>
+              </w:rPr>
+              <w:t>Thấp</w:t>
+            </w:r>
+          </w:p>
+        </w:tc>
+      </w:tr>
+    </w:tbl>
+    <w:p>
+      <w:pPr>
         <w:jc w:val="both"/>
         <w:rPr>
           <w:b/>
@@ -1436,8 +2823,604 @@
 </file>
 
 <file path=word/numbering.xml><?xml version="1.0" encoding="utf-8"?>
-<w:numbering xmlns:wpc="http://schemas.microsoft.com/office/word/2010/wordprocessingCanvas" xmlns:cx="http://schemas.microsoft.com/office/drawing/2014/chartex" xmlns:cx1="http://schemas.microsoft.com/office/drawing/2015/9/8/chartex" xmlns:cx2="http://schemas.microsoft.com/office/drawing/2015/10/21/chartex" xmlns:cx3="http://schemas.microsoft.com/office/drawing/2016/5/9/chartex" xmlns:cx4="http://schemas.microsoft.com/office/drawing/2016/5/10/chartex" xmlns:cx5="http://schemas.microsoft.com/office/drawing/2016/5/11/chartex" xmlns:cx6="http://schemas.microsoft.com/office/drawing/2016/5/12/chartex" xmlns:cx7="http://schemas.microsoft.com/office/drawing/2016/5/13/chartex" xmlns:cx8="http://schemas.microsoft.com/office/drawing/2016/5/14/chartex" xmlns:mc="http://schemas.openxmlformats.org/markup-compatibility/2006" xmlns:aink="http://schemas.microsoft.com/office/drawing/2016/ink" xmlns:am3d="http://schemas.microsoft.com/office/drawing/2017/model3d" xmlns:o="urn:schemas-microsoft-com:office:office" xmlns:oel="http://schemas.microsoft.com/office/2019/extlst" xmlns:r="http://schemas.openxmlformats.org/officeDocument/2006/relationships" xmlns:m="http://schemas.openxmlformats.org/officeDocument/2006/math" xmlns:v="urn:schemas-microsoft-com:vml" xmlns:wp14="http://schemas.microsoft.com/office/word/2010/wordprocessingDrawing" xmlns:wp="http://schemas.openxmlformats.org/drawingml/2006/wordprocessingDrawing" xmlns:w10="urn:schemas-microsoft-com:office:word" xmlns:w="http://schemas.openxmlformats.org/wordprocessingml/2006/main" xmlns:w14="http://schemas.microsoft.com/office/word/2010/wordml" xmlns:w15="http://schemas.microsoft.com/office/word/2012/wordml" xmlns:w16cex="http://schemas.microsoft.com/office/word/2018/wordml/cex" xmlns:w16cid="http://schemas.microsoft.com/office/word/2016/wordml/cid" xmlns:w16="http://schemas.microsoft.com/office/word/2018/wordml" xmlns:w16du="http://schemas.microsoft.com/office/word/2023/wordml/word16du" xmlns:w16sdtdh="http://schemas.microsoft.com/office/word/2020/wordml/sdtdatahash" xmlns:w16sdtfl="http://schemas.microsoft.com/office/word/2024/wordml/sdtformatlock" xmlns:w16se="http://schemas.microsoft.com/office/word/2015/wordml/symex" xmlns:wpg="http://schemas.microsoft.com/office/word/2010/wordprocessingGroup" xmlns:wpi="http://schemas.microsoft.com/office/word/2010/wordprocessingInk" xmlns:wne="http://schemas.microsoft.com/office/word/2006/wordml" xmlns:wps="http://schemas.microsoft.com/office/word/2010/wordprocessingShape" mc:Ignorable="w14 w15 w16se w16cid w16 w16cex w16sdtdh w16sdtfl w16du wp14">
+<w:numbering xmlns:wpc="http://schemas.microsoft.com/office/word/2010/wordprocessingCanvas" xmlns:cx="http://schemas.microsoft.com/office/drawing/2014/chartex" xmlns:mc="http://schemas.openxmlformats.org/markup-compatibility/2006" xmlns:o="urn:schemas-microsoft-com:office:office" xmlns:r="http://schemas.openxmlformats.org/officeDocument/2006/relationships" xmlns:m="http://schemas.openxmlformats.org/officeDocument/2006/math" xmlns:v="urn:schemas-microsoft-com:vml" xmlns:wp14="http://schemas.microsoft.com/office/word/2010/wordprocessingDrawing" xmlns:wp="http://schemas.openxmlformats.org/drawingml/2006/wordprocessingDrawing" xmlns:w10="urn:schemas-microsoft-com:office:word" xmlns:w="http://schemas.openxmlformats.org/wordprocessingml/2006/main" xmlns:w14="http://schemas.microsoft.com/office/word/2010/wordml" xmlns:w15="http://schemas.microsoft.com/office/word/2012/wordml" xmlns:w16se="http://schemas.microsoft.com/office/word/2015/wordml/symex" xmlns:wpg="http://schemas.microsoft.com/office/word/2010/wordprocessingGroup" xmlns:wpi="http://schemas.microsoft.com/office/word/2010/wordprocessingInk" xmlns:wne="http://schemas.microsoft.com/office/word/2006/wordml" xmlns:wps="http://schemas.microsoft.com/office/word/2010/wordprocessingShape" mc:Ignorable="w14 w15 w16se wp14">
   <w:abstractNum w:abstractNumId="0" w15:restartNumberingAfterBreak="0">
+    <w:nsid w:val="0E4365ED"/>
+    <w:multiLevelType w:val="multilevel"/>
+    <w:tmpl w:val="F1AE4CC4"/>
+    <w:lvl w:ilvl="0">
+      <w:start w:val="1"/>
+      <w:numFmt w:val="bullet"/>
+      <w:lvlText w:val=""/>
+      <w:lvlJc w:val="left"/>
+      <w:pPr>
+        <w:tabs>
+          <w:tab w:val="num" w:pos="720"/>
+        </w:tabs>
+        <w:ind w:left="720" w:hanging="360"/>
+      </w:pPr>
+      <w:rPr>
+        <w:rFonts w:ascii="Symbol" w:hAnsi="Symbol" w:hint="default"/>
+        <w:sz w:val="20"/>
+      </w:rPr>
+    </w:lvl>
+    <w:lvl w:ilvl="1" w:tentative="1">
+      <w:start w:val="1"/>
+      <w:numFmt w:val="bullet"/>
+      <w:lvlText w:val="o"/>
+      <w:lvlJc w:val="left"/>
+      <w:pPr>
+        <w:tabs>
+          <w:tab w:val="num" w:pos="1440"/>
+        </w:tabs>
+        <w:ind w:left="1440" w:hanging="360"/>
+      </w:pPr>
+      <w:rPr>
+        <w:rFonts w:ascii="Courier New" w:hAnsi="Courier New" w:hint="default"/>
+        <w:sz w:val="20"/>
+      </w:rPr>
+    </w:lvl>
+    <w:lvl w:ilvl="2" w:tentative="1">
+      <w:start w:val="1"/>
+      <w:numFmt w:val="bullet"/>
+      <w:lvlText w:val=""/>
+      <w:lvlJc w:val="left"/>
+      <w:pPr>
+        <w:tabs>
+          <w:tab w:val="num" w:pos="2160"/>
+        </w:tabs>
+        <w:ind w:left="2160" w:hanging="360"/>
+      </w:pPr>
+      <w:rPr>
+        <w:rFonts w:ascii="Wingdings" w:hAnsi="Wingdings" w:hint="default"/>
+        <w:sz w:val="20"/>
+      </w:rPr>
+    </w:lvl>
+    <w:lvl w:ilvl="3" w:tentative="1">
+      <w:start w:val="1"/>
+      <w:numFmt w:val="bullet"/>
+      <w:lvlText w:val=""/>
+      <w:lvlJc w:val="left"/>
+      <w:pPr>
+        <w:tabs>
+          <w:tab w:val="num" w:pos="2880"/>
+        </w:tabs>
+        <w:ind w:left="2880" w:hanging="360"/>
+      </w:pPr>
+      <w:rPr>
+        <w:rFonts w:ascii="Wingdings" w:hAnsi="Wingdings" w:hint="default"/>
+        <w:sz w:val="20"/>
+      </w:rPr>
+    </w:lvl>
+    <w:lvl w:ilvl="4" w:tentative="1">
+      <w:start w:val="1"/>
+      <w:numFmt w:val="bullet"/>
+      <w:lvlText w:val=""/>
+      <w:lvlJc w:val="left"/>
+      <w:pPr>
+        <w:tabs>
+          <w:tab w:val="num" w:pos="3600"/>
+        </w:tabs>
+        <w:ind w:left="3600" w:hanging="360"/>
+      </w:pPr>
+      <w:rPr>
+        <w:rFonts w:ascii="Wingdings" w:hAnsi="Wingdings" w:hint="default"/>
+        <w:sz w:val="20"/>
+      </w:rPr>
+    </w:lvl>
+    <w:lvl w:ilvl="5" w:tentative="1">
+      <w:start w:val="1"/>
+      <w:numFmt w:val="bullet"/>
+      <w:lvlText w:val=""/>
+      <w:lvlJc w:val="left"/>
+      <w:pPr>
+        <w:tabs>
+          <w:tab w:val="num" w:pos="4320"/>
+        </w:tabs>
+        <w:ind w:left="4320" w:hanging="360"/>
+      </w:pPr>
+      <w:rPr>
+        <w:rFonts w:ascii="Wingdings" w:hAnsi="Wingdings" w:hint="default"/>
+        <w:sz w:val="20"/>
+      </w:rPr>
+    </w:lvl>
+    <w:lvl w:ilvl="6" w:tentative="1">
+      <w:start w:val="1"/>
+      <w:numFmt w:val="bullet"/>
+      <w:lvlText w:val=""/>
+      <w:lvlJc w:val="left"/>
+      <w:pPr>
+        <w:tabs>
+          <w:tab w:val="num" w:pos="5040"/>
+        </w:tabs>
+        <w:ind w:left="5040" w:hanging="360"/>
+      </w:pPr>
+      <w:rPr>
+        <w:rFonts w:ascii="Wingdings" w:hAnsi="Wingdings" w:hint="default"/>
+        <w:sz w:val="20"/>
+      </w:rPr>
+    </w:lvl>
+    <w:lvl w:ilvl="7" w:tentative="1">
+      <w:start w:val="1"/>
+      <w:numFmt w:val="bullet"/>
+      <w:lvlText w:val=""/>
+      <w:lvlJc w:val="left"/>
+      <w:pPr>
+        <w:tabs>
+          <w:tab w:val="num" w:pos="5760"/>
+        </w:tabs>
+        <w:ind w:left="5760" w:hanging="360"/>
+      </w:pPr>
+      <w:rPr>
+        <w:rFonts w:ascii="Wingdings" w:hAnsi="Wingdings" w:hint="default"/>
+        <w:sz w:val="20"/>
+      </w:rPr>
+    </w:lvl>
+    <w:lvl w:ilvl="8" w:tentative="1">
+      <w:start w:val="1"/>
+      <w:numFmt w:val="bullet"/>
+      <w:lvlText w:val=""/>
+      <w:lvlJc w:val="left"/>
+      <w:pPr>
+        <w:tabs>
+          <w:tab w:val="num" w:pos="6480"/>
+        </w:tabs>
+        <w:ind w:left="6480" w:hanging="360"/>
+      </w:pPr>
+      <w:rPr>
+        <w:rFonts w:ascii="Wingdings" w:hAnsi="Wingdings" w:hint="default"/>
+        <w:sz w:val="20"/>
+      </w:rPr>
+    </w:lvl>
+  </w:abstractNum>
+  <w:abstractNum w:abstractNumId="1" w15:restartNumberingAfterBreak="0">
+    <w:nsid w:val="0F09779E"/>
+    <w:multiLevelType w:val="multilevel"/>
+    <w:tmpl w:val="9A4CE758"/>
+    <w:lvl w:ilvl="0">
+      <w:start w:val="1"/>
+      <w:numFmt w:val="bullet"/>
+      <w:lvlText w:val=""/>
+      <w:lvlJc w:val="left"/>
+      <w:pPr>
+        <w:tabs>
+          <w:tab w:val="num" w:pos="720"/>
+        </w:tabs>
+        <w:ind w:left="720" w:hanging="360"/>
+      </w:pPr>
+      <w:rPr>
+        <w:rFonts w:ascii="Symbol" w:hAnsi="Symbol" w:hint="default"/>
+        <w:sz w:val="20"/>
+      </w:rPr>
+    </w:lvl>
+    <w:lvl w:ilvl="1" w:tentative="1">
+      <w:start w:val="1"/>
+      <w:numFmt w:val="bullet"/>
+      <w:lvlText w:val="o"/>
+      <w:lvlJc w:val="left"/>
+      <w:pPr>
+        <w:tabs>
+          <w:tab w:val="num" w:pos="1440"/>
+        </w:tabs>
+        <w:ind w:left="1440" w:hanging="360"/>
+      </w:pPr>
+      <w:rPr>
+        <w:rFonts w:ascii="Courier New" w:hAnsi="Courier New" w:hint="default"/>
+        <w:sz w:val="20"/>
+      </w:rPr>
+    </w:lvl>
+    <w:lvl w:ilvl="2" w:tentative="1">
+      <w:start w:val="1"/>
+      <w:numFmt w:val="bullet"/>
+      <w:lvlText w:val=""/>
+      <w:lvlJc w:val="left"/>
+      <w:pPr>
+        <w:tabs>
+          <w:tab w:val="num" w:pos="2160"/>
+        </w:tabs>
+        <w:ind w:left="2160" w:hanging="360"/>
+      </w:pPr>
+      <w:rPr>
+        <w:rFonts w:ascii="Wingdings" w:hAnsi="Wingdings" w:hint="default"/>
+        <w:sz w:val="20"/>
+      </w:rPr>
+    </w:lvl>
+    <w:lvl w:ilvl="3" w:tentative="1">
+      <w:start w:val="1"/>
+      <w:numFmt w:val="bullet"/>
+      <w:lvlText w:val=""/>
+      <w:lvlJc w:val="left"/>
+      <w:pPr>
+        <w:tabs>
+          <w:tab w:val="num" w:pos="2880"/>
+        </w:tabs>
+        <w:ind w:left="2880" w:hanging="360"/>
+      </w:pPr>
+      <w:rPr>
+        <w:rFonts w:ascii="Wingdings" w:hAnsi="Wingdings" w:hint="default"/>
+        <w:sz w:val="20"/>
+      </w:rPr>
+    </w:lvl>
+    <w:lvl w:ilvl="4" w:tentative="1">
+      <w:start w:val="1"/>
+      <w:numFmt w:val="bullet"/>
+      <w:lvlText w:val=""/>
+      <w:lvlJc w:val="left"/>
+      <w:pPr>
+        <w:tabs>
+          <w:tab w:val="num" w:pos="3600"/>
+        </w:tabs>
+        <w:ind w:left="3600" w:hanging="360"/>
+      </w:pPr>
+      <w:rPr>
+        <w:rFonts w:ascii="Wingdings" w:hAnsi="Wingdings" w:hint="default"/>
+        <w:sz w:val="20"/>
+      </w:rPr>
+    </w:lvl>
+    <w:lvl w:ilvl="5" w:tentative="1">
+      <w:start w:val="1"/>
+      <w:numFmt w:val="bullet"/>
+      <w:lvlText w:val=""/>
+      <w:lvlJc w:val="left"/>
+      <w:pPr>
+        <w:tabs>
+          <w:tab w:val="num" w:pos="4320"/>
+        </w:tabs>
+        <w:ind w:left="4320" w:hanging="360"/>
+      </w:pPr>
+      <w:rPr>
+        <w:rFonts w:ascii="Wingdings" w:hAnsi="Wingdings" w:hint="default"/>
+        <w:sz w:val="20"/>
+      </w:rPr>
+    </w:lvl>
+    <w:lvl w:ilvl="6" w:tentative="1">
+      <w:start w:val="1"/>
+      <w:numFmt w:val="bullet"/>
+      <w:lvlText w:val=""/>
+      <w:lvlJc w:val="left"/>
+      <w:pPr>
+        <w:tabs>
+          <w:tab w:val="num" w:pos="5040"/>
+        </w:tabs>
+        <w:ind w:left="5040" w:hanging="360"/>
+      </w:pPr>
+      <w:rPr>
+        <w:rFonts w:ascii="Wingdings" w:hAnsi="Wingdings" w:hint="default"/>
+        <w:sz w:val="20"/>
+      </w:rPr>
+    </w:lvl>
+    <w:lvl w:ilvl="7" w:tentative="1">
+      <w:start w:val="1"/>
+      <w:numFmt w:val="bullet"/>
+      <w:lvlText w:val=""/>
+      <w:lvlJc w:val="left"/>
+      <w:pPr>
+        <w:tabs>
+          <w:tab w:val="num" w:pos="5760"/>
+        </w:tabs>
+        <w:ind w:left="5760" w:hanging="360"/>
+      </w:pPr>
+      <w:rPr>
+        <w:rFonts w:ascii="Wingdings" w:hAnsi="Wingdings" w:hint="default"/>
+        <w:sz w:val="20"/>
+      </w:rPr>
+    </w:lvl>
+    <w:lvl w:ilvl="8" w:tentative="1">
+      <w:start w:val="1"/>
+      <w:numFmt w:val="bullet"/>
+      <w:lvlText w:val=""/>
+      <w:lvlJc w:val="left"/>
+      <w:pPr>
+        <w:tabs>
+          <w:tab w:val="num" w:pos="6480"/>
+        </w:tabs>
+        <w:ind w:left="6480" w:hanging="360"/>
+      </w:pPr>
+      <w:rPr>
+        <w:rFonts w:ascii="Wingdings" w:hAnsi="Wingdings" w:hint="default"/>
+        <w:sz w:val="20"/>
+      </w:rPr>
+    </w:lvl>
+  </w:abstractNum>
+  <w:abstractNum w:abstractNumId="2" w15:restartNumberingAfterBreak="0">
+    <w:nsid w:val="1BD02A3B"/>
+    <w:multiLevelType w:val="multilevel"/>
+    <w:tmpl w:val="9134068E"/>
+    <w:lvl w:ilvl="0">
+      <w:start w:val="1"/>
+      <w:numFmt w:val="bullet"/>
+      <w:lvlText w:val=""/>
+      <w:lvlJc w:val="left"/>
+      <w:pPr>
+        <w:tabs>
+          <w:tab w:val="num" w:pos="720"/>
+        </w:tabs>
+        <w:ind w:left="720" w:hanging="360"/>
+      </w:pPr>
+      <w:rPr>
+        <w:rFonts w:ascii="Symbol" w:hAnsi="Symbol" w:hint="default"/>
+        <w:sz w:val="20"/>
+      </w:rPr>
+    </w:lvl>
+    <w:lvl w:ilvl="1" w:tentative="1">
+      <w:start w:val="1"/>
+      <w:numFmt w:val="bullet"/>
+      <w:lvlText w:val="o"/>
+      <w:lvlJc w:val="left"/>
+      <w:pPr>
+        <w:tabs>
+          <w:tab w:val="num" w:pos="1440"/>
+        </w:tabs>
+        <w:ind w:left="1440" w:hanging="360"/>
+      </w:pPr>
+      <w:rPr>
+        <w:rFonts w:ascii="Courier New" w:hAnsi="Courier New" w:hint="default"/>
+        <w:sz w:val="20"/>
+      </w:rPr>
+    </w:lvl>
+    <w:lvl w:ilvl="2" w:tentative="1">
+      <w:start w:val="1"/>
+      <w:numFmt w:val="bullet"/>
+      <w:lvlText w:val=""/>
+      <w:lvlJc w:val="left"/>
+      <w:pPr>
+        <w:tabs>
+          <w:tab w:val="num" w:pos="2160"/>
+        </w:tabs>
+        <w:ind w:left="2160" w:hanging="360"/>
+      </w:pPr>
+      <w:rPr>
+        <w:rFonts w:ascii="Wingdings" w:hAnsi="Wingdings" w:hint="default"/>
+        <w:sz w:val="20"/>
+      </w:rPr>
+    </w:lvl>
+    <w:lvl w:ilvl="3" w:tentative="1">
+      <w:start w:val="1"/>
+      <w:numFmt w:val="bullet"/>
+      <w:lvlText w:val=""/>
+      <w:lvlJc w:val="left"/>
+      <w:pPr>
+        <w:tabs>
+          <w:tab w:val="num" w:pos="2880"/>
+        </w:tabs>
+        <w:ind w:left="2880" w:hanging="360"/>
+      </w:pPr>
+      <w:rPr>
+        <w:rFonts w:ascii="Wingdings" w:hAnsi="Wingdings" w:hint="default"/>
+        <w:sz w:val="20"/>
+      </w:rPr>
+    </w:lvl>
+    <w:lvl w:ilvl="4" w:tentative="1">
+      <w:start w:val="1"/>
+      <w:numFmt w:val="bullet"/>
+      <w:lvlText w:val=""/>
+      <w:lvlJc w:val="left"/>
+      <w:pPr>
+        <w:tabs>
+          <w:tab w:val="num" w:pos="3600"/>
+        </w:tabs>
+        <w:ind w:left="3600" w:hanging="360"/>
+      </w:pPr>
+      <w:rPr>
+        <w:rFonts w:ascii="Wingdings" w:hAnsi="Wingdings" w:hint="default"/>
+        <w:sz w:val="20"/>
+      </w:rPr>
+    </w:lvl>
+    <w:lvl w:ilvl="5" w:tentative="1">
+      <w:start w:val="1"/>
+      <w:numFmt w:val="bullet"/>
+      <w:lvlText w:val=""/>
+      <w:lvlJc w:val="left"/>
+      <w:pPr>
+        <w:tabs>
+          <w:tab w:val="num" w:pos="4320"/>
+        </w:tabs>
+        <w:ind w:left="4320" w:hanging="360"/>
+      </w:pPr>
+      <w:rPr>
+        <w:rFonts w:ascii="Wingdings" w:hAnsi="Wingdings" w:hint="default"/>
+        <w:sz w:val="20"/>
+      </w:rPr>
+    </w:lvl>
+    <w:lvl w:ilvl="6" w:tentative="1">
+      <w:start w:val="1"/>
+      <w:numFmt w:val="bullet"/>
+      <w:lvlText w:val=""/>
+      <w:lvlJc w:val="left"/>
+      <w:pPr>
+        <w:tabs>
+          <w:tab w:val="num" w:pos="5040"/>
+        </w:tabs>
+        <w:ind w:left="5040" w:hanging="360"/>
+      </w:pPr>
+      <w:rPr>
+        <w:rFonts w:ascii="Wingdings" w:hAnsi="Wingdings" w:hint="default"/>
+        <w:sz w:val="20"/>
+      </w:rPr>
+    </w:lvl>
+    <w:lvl w:ilvl="7" w:tentative="1">
+      <w:start w:val="1"/>
+      <w:numFmt w:val="bullet"/>
+      <w:lvlText w:val=""/>
+      <w:lvlJc w:val="left"/>
+      <w:pPr>
+        <w:tabs>
+          <w:tab w:val="num" w:pos="5760"/>
+        </w:tabs>
+        <w:ind w:left="5760" w:hanging="360"/>
+      </w:pPr>
+      <w:rPr>
+        <w:rFonts w:ascii="Wingdings" w:hAnsi="Wingdings" w:hint="default"/>
+        <w:sz w:val="20"/>
+      </w:rPr>
+    </w:lvl>
+    <w:lvl w:ilvl="8" w:tentative="1">
+      <w:start w:val="1"/>
+      <w:numFmt w:val="bullet"/>
+      <w:lvlText w:val=""/>
+      <w:lvlJc w:val="left"/>
+      <w:pPr>
+        <w:tabs>
+          <w:tab w:val="num" w:pos="6480"/>
+        </w:tabs>
+        <w:ind w:left="6480" w:hanging="360"/>
+      </w:pPr>
+      <w:rPr>
+        <w:rFonts w:ascii="Wingdings" w:hAnsi="Wingdings" w:hint="default"/>
+        <w:sz w:val="20"/>
+      </w:rPr>
+    </w:lvl>
+  </w:abstractNum>
+  <w:abstractNum w:abstractNumId="3" w15:restartNumberingAfterBreak="0">
+    <w:nsid w:val="2FCF61D4"/>
+    <w:multiLevelType w:val="multilevel"/>
+    <w:tmpl w:val="9E827DDE"/>
+    <w:lvl w:ilvl="0">
+      <w:start w:val="1"/>
+      <w:numFmt w:val="bullet"/>
+      <w:lvlText w:val=""/>
+      <w:lvlJc w:val="left"/>
+      <w:pPr>
+        <w:tabs>
+          <w:tab w:val="num" w:pos="720"/>
+        </w:tabs>
+        <w:ind w:left="720" w:hanging="360"/>
+      </w:pPr>
+      <w:rPr>
+        <w:rFonts w:ascii="Symbol" w:hAnsi="Symbol" w:hint="default"/>
+        <w:sz w:val="20"/>
+      </w:rPr>
+    </w:lvl>
+    <w:lvl w:ilvl="1" w:tentative="1">
+      <w:start w:val="1"/>
+      <w:numFmt w:val="bullet"/>
+      <w:lvlText w:val="o"/>
+      <w:lvlJc w:val="left"/>
+      <w:pPr>
+        <w:tabs>
+          <w:tab w:val="num" w:pos="1440"/>
+        </w:tabs>
+        <w:ind w:left="1440" w:hanging="360"/>
+      </w:pPr>
+      <w:rPr>
+        <w:rFonts w:ascii="Courier New" w:hAnsi="Courier New" w:hint="default"/>
+        <w:sz w:val="20"/>
+      </w:rPr>
+    </w:lvl>
+    <w:lvl w:ilvl="2" w:tentative="1">
+      <w:start w:val="1"/>
+      <w:numFmt w:val="bullet"/>
+      <w:lvlText w:val=""/>
+      <w:lvlJc w:val="left"/>
+      <w:pPr>
+        <w:tabs>
+          <w:tab w:val="num" w:pos="2160"/>
+        </w:tabs>
+        <w:ind w:left="2160" w:hanging="360"/>
+      </w:pPr>
+      <w:rPr>
+        <w:rFonts w:ascii="Wingdings" w:hAnsi="Wingdings" w:hint="default"/>
+        <w:sz w:val="20"/>
+      </w:rPr>
+    </w:lvl>
+    <w:lvl w:ilvl="3" w:tentative="1">
+      <w:start w:val="1"/>
+      <w:numFmt w:val="bullet"/>
+      <w:lvlText w:val=""/>
+      <w:lvlJc w:val="left"/>
+      <w:pPr>
+        <w:tabs>
+          <w:tab w:val="num" w:pos="2880"/>
+        </w:tabs>
+        <w:ind w:left="2880" w:hanging="360"/>
+      </w:pPr>
+      <w:rPr>
+        <w:rFonts w:ascii="Wingdings" w:hAnsi="Wingdings" w:hint="default"/>
+        <w:sz w:val="20"/>
+      </w:rPr>
+    </w:lvl>
+    <w:lvl w:ilvl="4" w:tentative="1">
+      <w:start w:val="1"/>
+      <w:numFmt w:val="bullet"/>
+      <w:lvlText w:val=""/>
+      <w:lvlJc w:val="left"/>
+      <w:pPr>
+        <w:tabs>
+          <w:tab w:val="num" w:pos="3600"/>
+        </w:tabs>
+        <w:ind w:left="3600" w:hanging="360"/>
+      </w:pPr>
+      <w:rPr>
+        <w:rFonts w:ascii="Wingdings" w:hAnsi="Wingdings" w:hint="default"/>
+        <w:sz w:val="20"/>
+      </w:rPr>
+    </w:lvl>
+    <w:lvl w:ilvl="5" w:tentative="1">
+      <w:start w:val="1"/>
+      <w:numFmt w:val="bullet"/>
+      <w:lvlText w:val=""/>
+      <w:lvlJc w:val="left"/>
+      <w:pPr>
+        <w:tabs>
+          <w:tab w:val="num" w:pos="4320"/>
+        </w:tabs>
+        <w:ind w:left="4320" w:hanging="360"/>
+      </w:pPr>
+      <w:rPr>
+        <w:rFonts w:ascii="Wingdings" w:hAnsi="Wingdings" w:hint="default"/>
+        <w:sz w:val="20"/>
+      </w:rPr>
+    </w:lvl>
+    <w:lvl w:ilvl="6" w:tentative="1">
+      <w:start w:val="1"/>
+      <w:numFmt w:val="bullet"/>
+      <w:lvlText w:val=""/>
+      <w:lvlJc w:val="left"/>
+      <w:pPr>
+        <w:tabs>
+          <w:tab w:val="num" w:pos="5040"/>
+        </w:tabs>
+        <w:ind w:left="5040" w:hanging="360"/>
+      </w:pPr>
+      <w:rPr>
+        <w:rFonts w:ascii="Wingdings" w:hAnsi="Wingdings" w:hint="default"/>
+        <w:sz w:val="20"/>
+      </w:rPr>
+    </w:lvl>
+    <w:lvl w:ilvl="7" w:tentative="1">
+      <w:start w:val="1"/>
+      <w:numFmt w:val="bullet"/>
+      <w:lvlText w:val=""/>
+      <w:lvlJc w:val="left"/>
+      <w:pPr>
+        <w:tabs>
+          <w:tab w:val="num" w:pos="5760"/>
+        </w:tabs>
+        <w:ind w:left="5760" w:hanging="360"/>
+      </w:pPr>
+      <w:rPr>
+        <w:rFonts w:ascii="Wingdings" w:hAnsi="Wingdings" w:hint="default"/>
+        <w:sz w:val="20"/>
+      </w:rPr>
+    </w:lvl>
+    <w:lvl w:ilvl="8" w:tentative="1">
+      <w:start w:val="1"/>
+      <w:numFmt w:val="bullet"/>
+      <w:lvlText w:val=""/>
+      <w:lvlJc w:val="left"/>
+      <w:pPr>
+        <w:tabs>
+          <w:tab w:val="num" w:pos="6480"/>
+        </w:tabs>
+        <w:ind w:left="6480" w:hanging="360"/>
+      </w:pPr>
+      <w:rPr>
+        <w:rFonts w:ascii="Wingdings" w:hAnsi="Wingdings" w:hint="default"/>
+        <w:sz w:val="20"/>
+      </w:rPr>
+    </w:lvl>
+  </w:abstractNum>
+  <w:abstractNum w:abstractNumId="4" w15:restartNumberingAfterBreak="0">
     <w:nsid w:val="32954EB1"/>
     <w:multiLevelType w:val="multilevel"/>
     <w:tmpl w:val="674E7706"/>
@@ -1586,7 +3569,7 @@
       </w:rPr>
     </w:lvl>
   </w:abstractNum>
-  <w:abstractNum w:abstractNumId="1" w15:restartNumberingAfterBreak="0">
+  <w:abstractNum w:abstractNumId="5" w15:restartNumberingAfterBreak="0">
     <w:nsid w:val="3A0C0E7A"/>
     <w:multiLevelType w:val="multilevel"/>
     <w:tmpl w:val="372AA516"/>
@@ -1735,7 +3718,7 @@
       </w:rPr>
     </w:lvl>
   </w:abstractNum>
-  <w:abstractNum w:abstractNumId="2" w15:restartNumberingAfterBreak="0">
+  <w:abstractNum w:abstractNumId="6" w15:restartNumberingAfterBreak="0">
     <w:nsid w:val="3E3E0DE2"/>
     <w:multiLevelType w:val="multilevel"/>
     <w:tmpl w:val="9EE8A3B6"/>
@@ -1884,7 +3867,454 @@
       </w:rPr>
     </w:lvl>
   </w:abstractNum>
-  <w:abstractNum w:abstractNumId="3" w15:restartNumberingAfterBreak="0">
+  <w:abstractNum w:abstractNumId="7" w15:restartNumberingAfterBreak="0">
+    <w:nsid w:val="40A70402"/>
+    <w:multiLevelType w:val="multilevel"/>
+    <w:tmpl w:val="ECC87ADE"/>
+    <w:lvl w:ilvl="0">
+      <w:start w:val="1"/>
+      <w:numFmt w:val="bullet"/>
+      <w:lvlText w:val=""/>
+      <w:lvlJc w:val="left"/>
+      <w:pPr>
+        <w:tabs>
+          <w:tab w:val="num" w:pos="720"/>
+        </w:tabs>
+        <w:ind w:left="720" w:hanging="360"/>
+      </w:pPr>
+      <w:rPr>
+        <w:rFonts w:ascii="Symbol" w:hAnsi="Symbol" w:hint="default"/>
+        <w:sz w:val="20"/>
+      </w:rPr>
+    </w:lvl>
+    <w:lvl w:ilvl="1" w:tentative="1">
+      <w:start w:val="1"/>
+      <w:numFmt w:val="bullet"/>
+      <w:lvlText w:val="o"/>
+      <w:lvlJc w:val="left"/>
+      <w:pPr>
+        <w:tabs>
+          <w:tab w:val="num" w:pos="1440"/>
+        </w:tabs>
+        <w:ind w:left="1440" w:hanging="360"/>
+      </w:pPr>
+      <w:rPr>
+        <w:rFonts w:ascii="Courier New" w:hAnsi="Courier New" w:hint="default"/>
+        <w:sz w:val="20"/>
+      </w:rPr>
+    </w:lvl>
+    <w:lvl w:ilvl="2" w:tentative="1">
+      <w:start w:val="1"/>
+      <w:numFmt w:val="bullet"/>
+      <w:lvlText w:val=""/>
+      <w:lvlJc w:val="left"/>
+      <w:pPr>
+        <w:tabs>
+          <w:tab w:val="num" w:pos="2160"/>
+        </w:tabs>
+        <w:ind w:left="2160" w:hanging="360"/>
+      </w:pPr>
+      <w:rPr>
+        <w:rFonts w:ascii="Wingdings" w:hAnsi="Wingdings" w:hint="default"/>
+        <w:sz w:val="20"/>
+      </w:rPr>
+    </w:lvl>
+    <w:lvl w:ilvl="3" w:tentative="1">
+      <w:start w:val="1"/>
+      <w:numFmt w:val="bullet"/>
+      <w:lvlText w:val=""/>
+      <w:lvlJc w:val="left"/>
+      <w:pPr>
+        <w:tabs>
+          <w:tab w:val="num" w:pos="2880"/>
+        </w:tabs>
+        <w:ind w:left="2880" w:hanging="360"/>
+      </w:pPr>
+      <w:rPr>
+        <w:rFonts w:ascii="Wingdings" w:hAnsi="Wingdings" w:hint="default"/>
+        <w:sz w:val="20"/>
+      </w:rPr>
+    </w:lvl>
+    <w:lvl w:ilvl="4" w:tentative="1">
+      <w:start w:val="1"/>
+      <w:numFmt w:val="bullet"/>
+      <w:lvlText w:val=""/>
+      <w:lvlJc w:val="left"/>
+      <w:pPr>
+        <w:tabs>
+          <w:tab w:val="num" w:pos="3600"/>
+        </w:tabs>
+        <w:ind w:left="3600" w:hanging="360"/>
+      </w:pPr>
+      <w:rPr>
+        <w:rFonts w:ascii="Wingdings" w:hAnsi="Wingdings" w:hint="default"/>
+        <w:sz w:val="20"/>
+      </w:rPr>
+    </w:lvl>
+    <w:lvl w:ilvl="5" w:tentative="1">
+      <w:start w:val="1"/>
+      <w:numFmt w:val="bullet"/>
+      <w:lvlText w:val=""/>
+      <w:lvlJc w:val="left"/>
+      <w:pPr>
+        <w:tabs>
+          <w:tab w:val="num" w:pos="4320"/>
+        </w:tabs>
+        <w:ind w:left="4320" w:hanging="360"/>
+      </w:pPr>
+      <w:rPr>
+        <w:rFonts w:ascii="Wingdings" w:hAnsi="Wingdings" w:hint="default"/>
+        <w:sz w:val="20"/>
+      </w:rPr>
+    </w:lvl>
+    <w:lvl w:ilvl="6" w:tentative="1">
+      <w:start w:val="1"/>
+      <w:numFmt w:val="bullet"/>
+      <w:lvlText w:val=""/>
+      <w:lvlJc w:val="left"/>
+      <w:pPr>
+        <w:tabs>
+          <w:tab w:val="num" w:pos="5040"/>
+        </w:tabs>
+        <w:ind w:left="5040" w:hanging="360"/>
+      </w:pPr>
+      <w:rPr>
+        <w:rFonts w:ascii="Wingdings" w:hAnsi="Wingdings" w:hint="default"/>
+        <w:sz w:val="20"/>
+      </w:rPr>
+    </w:lvl>
+    <w:lvl w:ilvl="7" w:tentative="1">
+      <w:start w:val="1"/>
+      <w:numFmt w:val="bullet"/>
+      <w:lvlText w:val=""/>
+      <w:lvlJc w:val="left"/>
+      <w:pPr>
+        <w:tabs>
+          <w:tab w:val="num" w:pos="5760"/>
+        </w:tabs>
+        <w:ind w:left="5760" w:hanging="360"/>
+      </w:pPr>
+      <w:rPr>
+        <w:rFonts w:ascii="Wingdings" w:hAnsi="Wingdings" w:hint="default"/>
+        <w:sz w:val="20"/>
+      </w:rPr>
+    </w:lvl>
+    <w:lvl w:ilvl="8" w:tentative="1">
+      <w:start w:val="1"/>
+      <w:numFmt w:val="bullet"/>
+      <w:lvlText w:val=""/>
+      <w:lvlJc w:val="left"/>
+      <w:pPr>
+        <w:tabs>
+          <w:tab w:val="num" w:pos="6480"/>
+        </w:tabs>
+        <w:ind w:left="6480" w:hanging="360"/>
+      </w:pPr>
+      <w:rPr>
+        <w:rFonts w:ascii="Wingdings" w:hAnsi="Wingdings" w:hint="default"/>
+        <w:sz w:val="20"/>
+      </w:rPr>
+    </w:lvl>
+  </w:abstractNum>
+  <w:abstractNum w:abstractNumId="8" w15:restartNumberingAfterBreak="0">
+    <w:nsid w:val="5A233B4F"/>
+    <w:multiLevelType w:val="multilevel"/>
+    <w:tmpl w:val="1DF81E6A"/>
+    <w:lvl w:ilvl="0">
+      <w:start w:val="1"/>
+      <w:numFmt w:val="bullet"/>
+      <w:lvlText w:val=""/>
+      <w:lvlJc w:val="left"/>
+      <w:pPr>
+        <w:tabs>
+          <w:tab w:val="num" w:pos="720"/>
+        </w:tabs>
+        <w:ind w:left="720" w:hanging="360"/>
+      </w:pPr>
+      <w:rPr>
+        <w:rFonts w:ascii="Symbol" w:hAnsi="Symbol" w:hint="default"/>
+        <w:sz w:val="20"/>
+      </w:rPr>
+    </w:lvl>
+    <w:lvl w:ilvl="1" w:tentative="1">
+      <w:start w:val="1"/>
+      <w:numFmt w:val="bullet"/>
+      <w:lvlText w:val="o"/>
+      <w:lvlJc w:val="left"/>
+      <w:pPr>
+        <w:tabs>
+          <w:tab w:val="num" w:pos="1440"/>
+        </w:tabs>
+        <w:ind w:left="1440" w:hanging="360"/>
+      </w:pPr>
+      <w:rPr>
+        <w:rFonts w:ascii="Courier New" w:hAnsi="Courier New" w:hint="default"/>
+        <w:sz w:val="20"/>
+      </w:rPr>
+    </w:lvl>
+    <w:lvl w:ilvl="2" w:tentative="1">
+      <w:start w:val="1"/>
+      <w:numFmt w:val="bullet"/>
+      <w:lvlText w:val=""/>
+      <w:lvlJc w:val="left"/>
+      <w:pPr>
+        <w:tabs>
+          <w:tab w:val="num" w:pos="2160"/>
+        </w:tabs>
+        <w:ind w:left="2160" w:hanging="360"/>
+      </w:pPr>
+      <w:rPr>
+        <w:rFonts w:ascii="Wingdings" w:hAnsi="Wingdings" w:hint="default"/>
+        <w:sz w:val="20"/>
+      </w:rPr>
+    </w:lvl>
+    <w:lvl w:ilvl="3" w:tentative="1">
+      <w:start w:val="1"/>
+      <w:numFmt w:val="bullet"/>
+      <w:lvlText w:val=""/>
+      <w:lvlJc w:val="left"/>
+      <w:pPr>
+        <w:tabs>
+          <w:tab w:val="num" w:pos="2880"/>
+        </w:tabs>
+        <w:ind w:left="2880" w:hanging="360"/>
+      </w:pPr>
+      <w:rPr>
+        <w:rFonts w:ascii="Wingdings" w:hAnsi="Wingdings" w:hint="default"/>
+        <w:sz w:val="20"/>
+      </w:rPr>
+    </w:lvl>
+    <w:lvl w:ilvl="4" w:tentative="1">
+      <w:start w:val="1"/>
+      <w:numFmt w:val="bullet"/>
+      <w:lvlText w:val=""/>
+      <w:lvlJc w:val="left"/>
+      <w:pPr>
+        <w:tabs>
+          <w:tab w:val="num" w:pos="3600"/>
+        </w:tabs>
+        <w:ind w:left="3600" w:hanging="360"/>
+      </w:pPr>
+      <w:rPr>
+        <w:rFonts w:ascii="Wingdings" w:hAnsi="Wingdings" w:hint="default"/>
+        <w:sz w:val="20"/>
+      </w:rPr>
+    </w:lvl>
+    <w:lvl w:ilvl="5" w:tentative="1">
+      <w:start w:val="1"/>
+      <w:numFmt w:val="bullet"/>
+      <w:lvlText w:val=""/>
+      <w:lvlJc w:val="left"/>
+      <w:pPr>
+        <w:tabs>
+          <w:tab w:val="num" w:pos="4320"/>
+        </w:tabs>
+        <w:ind w:left="4320" w:hanging="360"/>
+      </w:pPr>
+      <w:rPr>
+        <w:rFonts w:ascii="Wingdings" w:hAnsi="Wingdings" w:hint="default"/>
+        <w:sz w:val="20"/>
+      </w:rPr>
+    </w:lvl>
+    <w:lvl w:ilvl="6" w:tentative="1">
+      <w:start w:val="1"/>
+      <w:numFmt w:val="bullet"/>
+      <w:lvlText w:val=""/>
+      <w:lvlJc w:val="left"/>
+      <w:pPr>
+        <w:tabs>
+          <w:tab w:val="num" w:pos="5040"/>
+        </w:tabs>
+        <w:ind w:left="5040" w:hanging="360"/>
+      </w:pPr>
+      <w:rPr>
+        <w:rFonts w:ascii="Wingdings" w:hAnsi="Wingdings" w:hint="default"/>
+        <w:sz w:val="20"/>
+      </w:rPr>
+    </w:lvl>
+    <w:lvl w:ilvl="7" w:tentative="1">
+      <w:start w:val="1"/>
+      <w:numFmt w:val="bullet"/>
+      <w:lvlText w:val=""/>
+      <w:lvlJc w:val="left"/>
+      <w:pPr>
+        <w:tabs>
+          <w:tab w:val="num" w:pos="5760"/>
+        </w:tabs>
+        <w:ind w:left="5760" w:hanging="360"/>
+      </w:pPr>
+      <w:rPr>
+        <w:rFonts w:ascii="Wingdings" w:hAnsi="Wingdings" w:hint="default"/>
+        <w:sz w:val="20"/>
+      </w:rPr>
+    </w:lvl>
+    <w:lvl w:ilvl="8" w:tentative="1">
+      <w:start w:val="1"/>
+      <w:numFmt w:val="bullet"/>
+      <w:lvlText w:val=""/>
+      <w:lvlJc w:val="left"/>
+      <w:pPr>
+        <w:tabs>
+          <w:tab w:val="num" w:pos="6480"/>
+        </w:tabs>
+        <w:ind w:left="6480" w:hanging="360"/>
+      </w:pPr>
+      <w:rPr>
+        <w:rFonts w:ascii="Wingdings" w:hAnsi="Wingdings" w:hint="default"/>
+        <w:sz w:val="20"/>
+      </w:rPr>
+    </w:lvl>
+  </w:abstractNum>
+  <w:abstractNum w:abstractNumId="9" w15:restartNumberingAfterBreak="0">
+    <w:nsid w:val="64DD3B58"/>
+    <w:multiLevelType w:val="multilevel"/>
+    <w:tmpl w:val="DF30D834"/>
+    <w:lvl w:ilvl="0">
+      <w:start w:val="1"/>
+      <w:numFmt w:val="bullet"/>
+      <w:lvlText w:val=""/>
+      <w:lvlJc w:val="left"/>
+      <w:pPr>
+        <w:tabs>
+          <w:tab w:val="num" w:pos="720"/>
+        </w:tabs>
+        <w:ind w:left="720" w:hanging="360"/>
+      </w:pPr>
+      <w:rPr>
+        <w:rFonts w:ascii="Symbol" w:hAnsi="Symbol" w:hint="default"/>
+        <w:sz w:val="20"/>
+      </w:rPr>
+    </w:lvl>
+    <w:lvl w:ilvl="1" w:tentative="1">
+      <w:start w:val="1"/>
+      <w:numFmt w:val="bullet"/>
+      <w:lvlText w:val="o"/>
+      <w:lvlJc w:val="left"/>
+      <w:pPr>
+        <w:tabs>
+          <w:tab w:val="num" w:pos="1440"/>
+        </w:tabs>
+        <w:ind w:left="1440" w:hanging="360"/>
+      </w:pPr>
+      <w:rPr>
+        <w:rFonts w:ascii="Courier New" w:hAnsi="Courier New" w:hint="default"/>
+        <w:sz w:val="20"/>
+      </w:rPr>
+    </w:lvl>
+    <w:lvl w:ilvl="2" w:tentative="1">
+      <w:start w:val="1"/>
+      <w:numFmt w:val="bullet"/>
+      <w:lvlText w:val=""/>
+      <w:lvlJc w:val="left"/>
+      <w:pPr>
+        <w:tabs>
+          <w:tab w:val="num" w:pos="2160"/>
+        </w:tabs>
+        <w:ind w:left="2160" w:hanging="360"/>
+      </w:pPr>
+      <w:rPr>
+        <w:rFonts w:ascii="Wingdings" w:hAnsi="Wingdings" w:hint="default"/>
+        <w:sz w:val="20"/>
+      </w:rPr>
+    </w:lvl>
+    <w:lvl w:ilvl="3" w:tentative="1">
+      <w:start w:val="1"/>
+      <w:numFmt w:val="bullet"/>
+      <w:lvlText w:val=""/>
+      <w:lvlJc w:val="left"/>
+      <w:pPr>
+        <w:tabs>
+          <w:tab w:val="num" w:pos="2880"/>
+        </w:tabs>
+        <w:ind w:left="2880" w:hanging="360"/>
+      </w:pPr>
+      <w:rPr>
+        <w:rFonts w:ascii="Wingdings" w:hAnsi="Wingdings" w:hint="default"/>
+        <w:sz w:val="20"/>
+      </w:rPr>
+    </w:lvl>
+    <w:lvl w:ilvl="4" w:tentative="1">
+      <w:start w:val="1"/>
+      <w:numFmt w:val="bullet"/>
+      <w:lvlText w:val=""/>
+      <w:lvlJc w:val="left"/>
+      <w:pPr>
+        <w:tabs>
+          <w:tab w:val="num" w:pos="3600"/>
+        </w:tabs>
+        <w:ind w:left="3600" w:hanging="360"/>
+      </w:pPr>
+      <w:rPr>
+        <w:rFonts w:ascii="Wingdings" w:hAnsi="Wingdings" w:hint="default"/>
+        <w:sz w:val="20"/>
+      </w:rPr>
+    </w:lvl>
+    <w:lvl w:ilvl="5" w:tentative="1">
+      <w:start w:val="1"/>
+      <w:numFmt w:val="bullet"/>
+      <w:lvlText w:val=""/>
+      <w:lvlJc w:val="left"/>
+      <w:pPr>
+        <w:tabs>
+          <w:tab w:val="num" w:pos="4320"/>
+        </w:tabs>
+        <w:ind w:left="4320" w:hanging="360"/>
+      </w:pPr>
+      <w:rPr>
+        <w:rFonts w:ascii="Wingdings" w:hAnsi="Wingdings" w:hint="default"/>
+        <w:sz w:val="20"/>
+      </w:rPr>
+    </w:lvl>
+    <w:lvl w:ilvl="6" w:tentative="1">
+      <w:start w:val="1"/>
+      <w:numFmt w:val="bullet"/>
+      <w:lvlText w:val=""/>
+      <w:lvlJc w:val="left"/>
+      <w:pPr>
+        <w:tabs>
+          <w:tab w:val="num" w:pos="5040"/>
+        </w:tabs>
+        <w:ind w:left="5040" w:hanging="360"/>
+      </w:pPr>
+      <w:rPr>
+        <w:rFonts w:ascii="Wingdings" w:hAnsi="Wingdings" w:hint="default"/>
+        <w:sz w:val="20"/>
+      </w:rPr>
+    </w:lvl>
+    <w:lvl w:ilvl="7" w:tentative="1">
+      <w:start w:val="1"/>
+      <w:numFmt w:val="bullet"/>
+      <w:lvlText w:val=""/>
+      <w:lvlJc w:val="left"/>
+      <w:pPr>
+        <w:tabs>
+          <w:tab w:val="num" w:pos="5760"/>
+        </w:tabs>
+        <w:ind w:left="5760" w:hanging="360"/>
+      </w:pPr>
+      <w:rPr>
+        <w:rFonts w:ascii="Wingdings" w:hAnsi="Wingdings" w:hint="default"/>
+        <w:sz w:val="20"/>
+      </w:rPr>
+    </w:lvl>
+    <w:lvl w:ilvl="8" w:tentative="1">
+      <w:start w:val="1"/>
+      <w:numFmt w:val="bullet"/>
+      <w:lvlText w:val=""/>
+      <w:lvlJc w:val="left"/>
+      <w:pPr>
+        <w:tabs>
+          <w:tab w:val="num" w:pos="6480"/>
+        </w:tabs>
+        <w:ind w:left="6480" w:hanging="360"/>
+      </w:pPr>
+      <w:rPr>
+        <w:rFonts w:ascii="Wingdings" w:hAnsi="Wingdings" w:hint="default"/>
+        <w:sz w:val="20"/>
+      </w:rPr>
+    </w:lvl>
+  </w:abstractNum>
+  <w:abstractNum w:abstractNumId="10" w15:restartNumberingAfterBreak="0">
     <w:nsid w:val="6B672229"/>
     <w:multiLevelType w:val="multilevel"/>
     <w:tmpl w:val="6576FFAC"/>
@@ -2033,7 +4463,7 @@
       </w:rPr>
     </w:lvl>
   </w:abstractNum>
-  <w:abstractNum w:abstractNumId="4" w15:restartNumberingAfterBreak="0">
+  <w:abstractNum w:abstractNumId="11" w15:restartNumberingAfterBreak="0">
     <w:nsid w:val="6BAC6526"/>
     <w:multiLevelType w:val="hybridMultilevel"/>
     <w:tmpl w:val="61A2153E"/>
@@ -2145,7 +4575,156 @@
       </w:rPr>
     </w:lvl>
   </w:abstractNum>
-  <w:abstractNum w:abstractNumId="5" w15:restartNumberingAfterBreak="0">
+  <w:abstractNum w:abstractNumId="12" w15:restartNumberingAfterBreak="0">
+    <w:nsid w:val="6D9C546B"/>
+    <w:multiLevelType w:val="multilevel"/>
+    <w:tmpl w:val="BC849146"/>
+    <w:lvl w:ilvl="0">
+      <w:start w:val="1"/>
+      <w:numFmt w:val="bullet"/>
+      <w:lvlText w:val=""/>
+      <w:lvlJc w:val="left"/>
+      <w:pPr>
+        <w:tabs>
+          <w:tab w:val="num" w:pos="720"/>
+        </w:tabs>
+        <w:ind w:left="720" w:hanging="360"/>
+      </w:pPr>
+      <w:rPr>
+        <w:rFonts w:ascii="Symbol" w:hAnsi="Symbol" w:hint="default"/>
+        <w:sz w:val="20"/>
+      </w:rPr>
+    </w:lvl>
+    <w:lvl w:ilvl="1" w:tentative="1">
+      <w:start w:val="1"/>
+      <w:numFmt w:val="bullet"/>
+      <w:lvlText w:val="o"/>
+      <w:lvlJc w:val="left"/>
+      <w:pPr>
+        <w:tabs>
+          <w:tab w:val="num" w:pos="1440"/>
+        </w:tabs>
+        <w:ind w:left="1440" w:hanging="360"/>
+      </w:pPr>
+      <w:rPr>
+        <w:rFonts w:ascii="Courier New" w:hAnsi="Courier New" w:hint="default"/>
+        <w:sz w:val="20"/>
+      </w:rPr>
+    </w:lvl>
+    <w:lvl w:ilvl="2" w:tentative="1">
+      <w:start w:val="1"/>
+      <w:numFmt w:val="bullet"/>
+      <w:lvlText w:val=""/>
+      <w:lvlJc w:val="left"/>
+      <w:pPr>
+        <w:tabs>
+          <w:tab w:val="num" w:pos="2160"/>
+        </w:tabs>
+        <w:ind w:left="2160" w:hanging="360"/>
+      </w:pPr>
+      <w:rPr>
+        <w:rFonts w:ascii="Wingdings" w:hAnsi="Wingdings" w:hint="default"/>
+        <w:sz w:val="20"/>
+      </w:rPr>
+    </w:lvl>
+    <w:lvl w:ilvl="3" w:tentative="1">
+      <w:start w:val="1"/>
+      <w:numFmt w:val="bullet"/>
+      <w:lvlText w:val=""/>
+      <w:lvlJc w:val="left"/>
+      <w:pPr>
+        <w:tabs>
+          <w:tab w:val="num" w:pos="2880"/>
+        </w:tabs>
+        <w:ind w:left="2880" w:hanging="360"/>
+      </w:pPr>
+      <w:rPr>
+        <w:rFonts w:ascii="Wingdings" w:hAnsi="Wingdings" w:hint="default"/>
+        <w:sz w:val="20"/>
+      </w:rPr>
+    </w:lvl>
+    <w:lvl w:ilvl="4" w:tentative="1">
+      <w:start w:val="1"/>
+      <w:numFmt w:val="bullet"/>
+      <w:lvlText w:val=""/>
+      <w:lvlJc w:val="left"/>
+      <w:pPr>
+        <w:tabs>
+          <w:tab w:val="num" w:pos="3600"/>
+        </w:tabs>
+        <w:ind w:left="3600" w:hanging="360"/>
+      </w:pPr>
+      <w:rPr>
+        <w:rFonts w:ascii="Wingdings" w:hAnsi="Wingdings" w:hint="default"/>
+        <w:sz w:val="20"/>
+      </w:rPr>
+    </w:lvl>
+    <w:lvl w:ilvl="5" w:tentative="1">
+      <w:start w:val="1"/>
+      <w:numFmt w:val="bullet"/>
+      <w:lvlText w:val=""/>
+      <w:lvlJc w:val="left"/>
+      <w:pPr>
+        <w:tabs>
+          <w:tab w:val="num" w:pos="4320"/>
+        </w:tabs>
+        <w:ind w:left="4320" w:hanging="360"/>
+      </w:pPr>
+      <w:rPr>
+        <w:rFonts w:ascii="Wingdings" w:hAnsi="Wingdings" w:hint="default"/>
+        <w:sz w:val="20"/>
+      </w:rPr>
+    </w:lvl>
+    <w:lvl w:ilvl="6" w:tentative="1">
+      <w:start w:val="1"/>
+      <w:numFmt w:val="bullet"/>
+      <w:lvlText w:val=""/>
+      <w:lvlJc w:val="left"/>
+      <w:pPr>
+        <w:tabs>
+          <w:tab w:val="num" w:pos="5040"/>
+        </w:tabs>
+        <w:ind w:left="5040" w:hanging="360"/>
+      </w:pPr>
+      <w:rPr>
+        <w:rFonts w:ascii="Wingdings" w:hAnsi="Wingdings" w:hint="default"/>
+        <w:sz w:val="20"/>
+      </w:rPr>
+    </w:lvl>
+    <w:lvl w:ilvl="7" w:tentative="1">
+      <w:start w:val="1"/>
+      <w:numFmt w:val="bullet"/>
+      <w:lvlText w:val=""/>
+      <w:lvlJc w:val="left"/>
+      <w:pPr>
+        <w:tabs>
+          <w:tab w:val="num" w:pos="5760"/>
+        </w:tabs>
+        <w:ind w:left="5760" w:hanging="360"/>
+      </w:pPr>
+      <w:rPr>
+        <w:rFonts w:ascii="Wingdings" w:hAnsi="Wingdings" w:hint="default"/>
+        <w:sz w:val="20"/>
+      </w:rPr>
+    </w:lvl>
+    <w:lvl w:ilvl="8" w:tentative="1">
+      <w:start w:val="1"/>
+      <w:numFmt w:val="bullet"/>
+      <w:lvlText w:val=""/>
+      <w:lvlJc w:val="left"/>
+      <w:pPr>
+        <w:tabs>
+          <w:tab w:val="num" w:pos="6480"/>
+        </w:tabs>
+        <w:ind w:left="6480" w:hanging="360"/>
+      </w:pPr>
+      <w:rPr>
+        <w:rFonts w:ascii="Wingdings" w:hAnsi="Wingdings" w:hint="default"/>
+        <w:sz w:val="20"/>
+      </w:rPr>
+    </w:lvl>
+  </w:abstractNum>
+  <w:abstractNum w:abstractNumId="13" w15:restartNumberingAfterBreak="0">
     <w:nsid w:val="6EAD348C"/>
     <w:multiLevelType w:val="multilevel"/>
     <w:tmpl w:val="25D26770"/>
@@ -2294,7 +4873,7 @@
       </w:rPr>
     </w:lvl>
   </w:abstractNum>
-  <w:abstractNum w:abstractNumId="6" w15:restartNumberingAfterBreak="0">
+  <w:abstractNum w:abstractNumId="14" w15:restartNumberingAfterBreak="0">
     <w:nsid w:val="7A2E0A5A"/>
     <w:multiLevelType w:val="multilevel"/>
     <w:tmpl w:val="86560FD8"/>
@@ -2443,32 +5022,56 @@
       </w:rPr>
     </w:lvl>
   </w:abstractNum>
-  <w:num w:numId="1" w16cid:durableId="455872448">
+  <w:num w:numId="1">
+    <w:abstractNumId w:val="11"/>
+  </w:num>
+  <w:num w:numId="2">
+    <w:abstractNumId w:val="13"/>
+  </w:num>
+  <w:num w:numId="3">
     <w:abstractNumId w:val="4"/>
   </w:num>
-  <w:num w:numId="2" w16cid:durableId="1287736034">
+  <w:num w:numId="4">
+    <w:abstractNumId w:val="10"/>
+  </w:num>
+  <w:num w:numId="5">
     <w:abstractNumId w:val="5"/>
   </w:num>
-  <w:num w:numId="3" w16cid:durableId="1506019767">
-    <w:abstractNumId w:val="0"/>
+  <w:num w:numId="6">
+    <w:abstractNumId w:val="6"/>
   </w:num>
-  <w:num w:numId="4" w16cid:durableId="185292613">
+  <w:num w:numId="7">
+    <w:abstractNumId w:val="14"/>
+  </w:num>
+  <w:num w:numId="8">
     <w:abstractNumId w:val="3"/>
   </w:num>
-  <w:num w:numId="5" w16cid:durableId="1483307467">
+  <w:num w:numId="9">
+    <w:abstractNumId w:val="2"/>
+  </w:num>
+  <w:num w:numId="10">
+    <w:abstractNumId w:val="12"/>
+  </w:num>
+  <w:num w:numId="11">
+    <w:abstractNumId w:val="8"/>
+  </w:num>
+  <w:num w:numId="12">
     <w:abstractNumId w:val="1"/>
   </w:num>
-  <w:num w:numId="6" w16cid:durableId="20254178">
-    <w:abstractNumId w:val="2"/>
+  <w:num w:numId="13">
+    <w:abstractNumId w:val="9"/>
   </w:num>
-  <w:num w:numId="7" w16cid:durableId="469711380">
-    <w:abstractNumId w:val="6"/>
+  <w:num w:numId="14">
+    <w:abstractNumId w:val="7"/>
+  </w:num>
+  <w:num w:numId="15">
+    <w:abstractNumId w:val="0"/>
   </w:num>
 </w:numbering>
 </file>
 
 <file path=word/styles.xml><?xml version="1.0" encoding="utf-8"?>
-<w:styles xmlns:mc="http://schemas.openxmlformats.org/markup-compatibility/2006" xmlns:r="http://schemas.openxmlformats.org/officeDocument/2006/relationships" xmlns:w="http://schemas.openxmlformats.org/wordprocessingml/2006/main" xmlns:w14="http://schemas.microsoft.com/office/word/2010/wordml" xmlns:w15="http://schemas.microsoft.com/office/word/2012/wordml" xmlns:w16cex="http://schemas.microsoft.com/office/word/2018/wordml/cex" xmlns:w16cid="http://schemas.microsoft.com/office/word/2016/wordml/cid" xmlns:w16="http://schemas.microsoft.com/office/word/2018/wordml" xmlns:w16du="http://schemas.microsoft.com/office/word/2023/wordml/word16du" xmlns:w16sdtdh="http://schemas.microsoft.com/office/word/2020/wordml/sdtdatahash" xmlns:w16sdtfl="http://schemas.microsoft.com/office/word/2024/wordml/sdtformatlock" xmlns:w16se="http://schemas.microsoft.com/office/word/2015/wordml/symex" mc:Ignorable="w14 w15 w16se w16cid w16 w16cex w16sdtdh w16sdtfl w16du">
+<w:styles xmlns:mc="http://schemas.openxmlformats.org/markup-compatibility/2006" xmlns:r="http://schemas.openxmlformats.org/officeDocument/2006/relationships" xmlns:w="http://schemas.openxmlformats.org/wordprocessingml/2006/main" xmlns:w14="http://schemas.microsoft.com/office/word/2010/wordml" xmlns:w15="http://schemas.microsoft.com/office/word/2012/wordml" xmlns:w16se="http://schemas.microsoft.com/office/word/2015/wordml/symex" mc:Ignorable="w14 w15 w16se">
   <w:docDefaults>
     <w:rPrDefault>
       <w:rPr>
@@ -2486,7 +5089,7 @@
       </w:pPr>
     </w:pPrDefault>
   </w:docDefaults>
-  <w:latentStyles w:defLockedState="0" w:defUIPriority="99" w:defSemiHidden="0" w:defUnhideWhenUsed="0" w:defQFormat="0" w:count="376">
+  <w:latentStyles w:defLockedState="0" w:defUIPriority="99" w:defSemiHidden="0" w:defUnhideWhenUsed="0" w:defQFormat="0" w:count="371">
     <w:lsdException w:name="Normal" w:uiPriority="0" w:qFormat="1"/>
     <w:lsdException w:name="heading 1" w:uiPriority="9" w:qFormat="1"/>
     <w:lsdException w:name="heading 2" w:semiHidden="1" w:uiPriority="9" w:unhideWhenUsed="1" w:qFormat="1"/>
@@ -2858,11 +5461,6 @@
     <w:lsdException w:name="List Table 5 Dark Accent 6" w:uiPriority="50"/>
     <w:lsdException w:name="List Table 6 Colorful Accent 6" w:uiPriority="51"/>
     <w:lsdException w:name="List Table 7 Colorful Accent 6" w:uiPriority="52"/>
-    <w:lsdException w:name="Mention" w:semiHidden="1" w:unhideWhenUsed="1"/>
-    <w:lsdException w:name="Smart Hyperlink" w:semiHidden="1" w:unhideWhenUsed="1"/>
-    <w:lsdException w:name="Hashtag" w:semiHidden="1" w:unhideWhenUsed="1"/>
-    <w:lsdException w:name="Unresolved Mention" w:semiHidden="1" w:unhideWhenUsed="1"/>
-    <w:lsdException w:name="Smart Link" w:semiHidden="1" w:unhideWhenUsed="1"/>
   </w:latentStyles>
   <w:style w:type="paragraph" w:default="1" w:styleId="Normal">
     <w:name w:val="Normal"/>
@@ -3069,6 +5667,7 @@
   <w:style w:type="character" w:default="1" w:styleId="DefaultParagraphFont">
     <w:name w:val="Default Paragraph Font"/>
     <w:uiPriority w:val="1"/>
+    <w:semiHidden/>
     <w:unhideWhenUsed/>
   </w:style>
   <w:style w:type="table" w:default="1" w:styleId="TableNormal">
@@ -3381,6 +5980,33 @@
       <w:spacing w:val="5"/>
     </w:rPr>
   </w:style>
+  <w:style w:type="paragraph" w:styleId="NormalWeb">
+    <w:name w:val="Normal (Web)"/>
+    <w:basedOn w:val="Normal"/>
+    <w:uiPriority w:val="99"/>
+    <w:semiHidden/>
+    <w:unhideWhenUsed/>
+    <w:rsid w:val="00BD428F"/>
+    <w:pPr>
+      <w:spacing w:before="100" w:beforeAutospacing="1" w:after="100" w:afterAutospacing="1" w:line="240" w:lineRule="auto"/>
+    </w:pPr>
+    <w:rPr>
+      <w:rFonts w:ascii="Times New Roman" w:eastAsia="Times New Roman" w:hAnsi="Times New Roman" w:cs="Times New Roman"/>
+      <w:kern w:val="0"/>
+      <w14:ligatures w14:val="none"/>
+    </w:rPr>
+  </w:style>
+  <w:style w:type="character" w:styleId="Strong">
+    <w:name w:val="Strong"/>
+    <w:basedOn w:val="DefaultParagraphFont"/>
+    <w:uiPriority w:val="22"/>
+    <w:qFormat/>
+    <w:rsid w:val="00BD428F"/>
+    <w:rPr>
+      <w:b/>
+      <w:bCs/>
+    </w:rPr>
+  </w:style>
 </w:styles>
 </file>
 

</xml_diff>